<commit_message>
Se finaliza seccion # 3 de manual tecnico
</commit_message>
<xml_diff>
--- a/Manual Técnico Sena Contigo.docx
+++ b/Manual Técnico Sena Contigo.docx
@@ -2253,8 +2253,6 @@
           <w:lang w:val="es-CO"/>
         </w:rPr>
       </w:pPr>
-      <w:bookmarkStart w:id="15" w:name="_GoBack"/>
-      <w:bookmarkEnd w:id="15"/>
     </w:p>
     <w:p>
       <w:pPr>
@@ -2448,36 +2446,8 @@
           <w:lang w:val="es-CO"/>
         </w:rPr>
       </w:pPr>
-      <w:bookmarkStart w:id="16" w:name="_5grf3iyefvde" w:colFirst="0" w:colLast="0"/>
-      <w:bookmarkEnd w:id="16"/>
-    </w:p>
-    <w:p>
-      <w:pPr>
-        <w:rPr>
-          <w:lang w:val="es-CO"/>
-        </w:rPr>
-      </w:pPr>
-    </w:p>
-    <w:p>
-      <w:pPr>
-        <w:rPr>
-          <w:lang w:val="es-CO"/>
-        </w:rPr>
-      </w:pPr>
-    </w:p>
-    <w:p>
-      <w:pPr>
-        <w:rPr>
-          <w:lang w:val="es-CO"/>
-        </w:rPr>
-      </w:pPr>
-    </w:p>
-    <w:p>
-      <w:pPr>
-        <w:rPr>
-          <w:lang w:val="es-CO"/>
-        </w:rPr>
-      </w:pPr>
+      <w:bookmarkStart w:id="15" w:name="_5grf3iyefvde" w:colFirst="0" w:colLast="0"/>
+      <w:bookmarkEnd w:id="15"/>
     </w:p>
     <w:p>
       <w:pPr>
@@ -2517,6 +2487,9 @@
     <w:p>
       <w:pPr>
         <w:spacing w:before="240" w:after="240"/>
+        <w:rPr>
+          <w:lang w:val="es-CO"/>
+        </w:rPr>
       </w:pPr>
       <w:r>
         <w:rPr>
@@ -2536,74 +2509,49 @@
         <w:rPr>
           <w:lang w:val="es-CO"/>
         </w:rPr>
-        <w:t xml:space="preserve"> que integra múltiples módulos funcionales para dar servicio tanto a un mercado en línea como a una plataforma de aprendizaje. </w:t>
-      </w:r>
-      <w:r>
-        <w:t xml:space="preserve">El </w:t>
-      </w:r>
-      <w:proofErr w:type="spellStart"/>
-      <w:r>
-        <w:t>sistema</w:t>
-      </w:r>
-      <w:proofErr w:type="spellEnd"/>
-      <w:r>
+        <w:t xml:space="preserve"> que integra múltiples </w:t>
+      </w:r>
+      <w:r>
+        <w:rPr>
+          <w:lang w:val="es-CO"/>
+        </w:rPr>
+        <w:t>archivos</w:t>
+      </w:r>
+      <w:r>
+        <w:rPr>
+          <w:lang w:val="es-CO"/>
+        </w:rPr>
         <w:t xml:space="preserve"> </w:t>
       </w:r>
-      <w:proofErr w:type="spellStart"/>
-      <w:r>
-        <w:t>está</w:t>
-      </w:r>
-      <w:proofErr w:type="spellEnd"/>
-      <w:r>
-        <w:t xml:space="preserve"> </w:t>
-      </w:r>
-      <w:proofErr w:type="spellStart"/>
-      <w:r>
-        <w:t>estructurado</w:t>
-      </w:r>
-      <w:proofErr w:type="spellEnd"/>
-      <w:r>
-        <w:t xml:space="preserve"> </w:t>
-      </w:r>
-      <w:proofErr w:type="spellStart"/>
-      <w:r>
-        <w:t>en</w:t>
-      </w:r>
-      <w:proofErr w:type="spellEnd"/>
-      <w:r>
-        <w:t xml:space="preserve"> </w:t>
-      </w:r>
-      <w:proofErr w:type="spellStart"/>
-      <w:r>
-        <w:t>los</w:t>
-      </w:r>
-      <w:proofErr w:type="spellEnd"/>
-      <w:r>
-        <w:t xml:space="preserve"> </w:t>
-      </w:r>
-      <w:proofErr w:type="spellStart"/>
-      <w:r>
-        <w:t>siguientes</w:t>
-      </w:r>
-      <w:proofErr w:type="spellEnd"/>
-      <w:r>
-        <w:t xml:space="preserve"> </w:t>
-      </w:r>
-      <w:proofErr w:type="spellStart"/>
-      <w:r>
-        <w:t>módulos</w:t>
-      </w:r>
-      <w:proofErr w:type="spellEnd"/>
-      <w:r>
-        <w:t xml:space="preserve"> </w:t>
-      </w:r>
-      <w:proofErr w:type="spellStart"/>
-      <w:r>
-        <w:t>principales</w:t>
-      </w:r>
-      <w:proofErr w:type="spellEnd"/>
-      <w:r>
-        <w:t>:</w:t>
+      <w:r>
+        <w:rPr>
+          <w:lang w:val="es-CO"/>
+        </w:rPr>
+        <w:t>con patrón de diseño MVC para dar servicio al sistema de retención estudiantil</w:t>
+      </w:r>
+      <w:r>
+        <w:rPr>
+          <w:lang w:val="es-CO"/>
+        </w:rPr>
+        <w:t xml:space="preserve">. </w:t>
+      </w:r>
+      <w:r>
+        <w:rPr>
+          <w:lang w:val="es-CO"/>
+        </w:rPr>
+        <w:t xml:space="preserve">El sistema está estructurado en los siguientes </w:t>
+      </w:r>
+      <w:r>
+        <w:rPr>
+          <w:lang w:val="es-CO"/>
+        </w:rPr>
+        <w:t>archivos</w:t>
+      </w:r>
+      <w:r>
+        <w:rPr>
+          <w:lang w:val="es-CO"/>
+        </w:rPr>
+        <w:t xml:space="preserve"> principales:</w:t>
       </w:r>
     </w:p>
     <w:p>
@@ -2623,13 +2571,113 @@
           <w:bCs/>
           <w:lang w:val="es-CO"/>
         </w:rPr>
-        <w:t xml:space="preserve">Módulo de Autenticación y Usuarios: </w:t>
-      </w:r>
-      <w:r>
-        <w:rPr>
-          <w:lang w:val="es-CO"/>
-        </w:rPr>
-        <w:t>Gestión de usuarios, sesiones, roles (USER, ADMIN, PSYCHOLOGIST, INSTRUCTOR) y autorización utilizando NextAuth.js.</w:t>
+        <w:t>Archivo</w:t>
+      </w:r>
+      <w:r>
+        <w:rPr>
+          <w:b/>
+          <w:bCs/>
+          <w:lang w:val="es-CO"/>
+        </w:rPr>
+        <w:t xml:space="preserve"> </w:t>
+      </w:r>
+      <w:proofErr w:type="spellStart"/>
+      <w:r>
+        <w:rPr>
+          <w:b/>
+          <w:bCs/>
+          <w:lang w:val="es-CO"/>
+        </w:rPr>
+        <w:t>Config</w:t>
+      </w:r>
+      <w:proofErr w:type="spellEnd"/>
+      <w:r>
+        <w:rPr>
+          <w:b/>
+          <w:bCs/>
+          <w:lang w:val="es-CO"/>
+        </w:rPr>
+        <w:t xml:space="preserve">: </w:t>
+      </w:r>
+      <w:r>
+        <w:rPr>
+          <w:lang w:val="es-CO"/>
+        </w:rPr>
+        <w:t>Configuración de envió de correo electrónico (</w:t>
+      </w:r>
+      <w:proofErr w:type="spellStart"/>
+      <w:r>
+        <w:rPr>
+          <w:lang w:val="es-CO"/>
+        </w:rPr>
+        <w:t>email.php</w:t>
+      </w:r>
+      <w:proofErr w:type="spellEnd"/>
+      <w:r>
+        <w:rPr>
+          <w:lang w:val="es-CO"/>
+        </w:rPr>
+        <w:t>)</w:t>
+      </w:r>
+      <w:r>
+        <w:rPr>
+          <w:lang w:val="es-CO"/>
+        </w:rPr>
+        <w:t xml:space="preserve">, </w:t>
+      </w:r>
+      <w:r>
+        <w:rPr>
+          <w:lang w:val="es-CO"/>
+        </w:rPr>
+        <w:t>c</w:t>
+      </w:r>
+      <w:r>
+        <w:rPr>
+          <w:lang w:val="es-CO"/>
+        </w:rPr>
+        <w:t xml:space="preserve">onfiguración de conexión de base de datos </w:t>
+      </w:r>
+      <w:proofErr w:type="spellStart"/>
+      <w:r>
+        <w:rPr>
+          <w:lang w:val="es-CO"/>
+        </w:rPr>
+        <w:t>Postgres</w:t>
+      </w:r>
+      <w:proofErr w:type="spellEnd"/>
+      <w:r>
+        <w:rPr>
+          <w:lang w:val="es-CO"/>
+        </w:rPr>
+        <w:t xml:space="preserve"> (</w:t>
+      </w:r>
+      <w:proofErr w:type="spellStart"/>
+      <w:r>
+        <w:rPr>
+          <w:lang w:val="es-CO"/>
+        </w:rPr>
+        <w:t>global.php</w:t>
+      </w:r>
+      <w:proofErr w:type="spellEnd"/>
+      <w:r>
+        <w:rPr>
+          <w:lang w:val="es-CO"/>
+        </w:rPr>
+        <w:t>) y creación de rutas de todo el sistema (</w:t>
+      </w:r>
+      <w:proofErr w:type="spellStart"/>
+      <w:r>
+        <w:rPr>
+          <w:lang w:val="es-CO"/>
+        </w:rPr>
+        <w:t>routes.php</w:t>
+      </w:r>
+      <w:proofErr w:type="spellEnd"/>
+      <w:r>
+        <w:rPr>
+          <w:lang w:val="es-CO"/>
+        </w:rPr>
+        <w:t>)</w:t>
       </w:r>
     </w:p>
     <w:p>
@@ -2649,13 +2697,51 @@
           <w:bCs/>
           <w:lang w:val="es-CO"/>
         </w:rPr>
-        <w:t>Módulo de Productos y Catálogo:</w:t>
-      </w:r>
-      <w:r>
-        <w:rPr>
-          <w:lang w:val="es-CO"/>
-        </w:rPr>
-        <w:t xml:space="preserve"> Administración y visualización de productos, incluyendo variantes por talla y color, categorías y colecciones.</w:t>
+        <w:t xml:space="preserve">Archivo </w:t>
+      </w:r>
+      <w:proofErr w:type="spellStart"/>
+      <w:r>
+        <w:rPr>
+          <w:b/>
+          <w:bCs/>
+          <w:lang w:val="es-CO"/>
+        </w:rPr>
+        <w:t>Controllers</w:t>
+      </w:r>
+      <w:proofErr w:type="spellEnd"/>
+      <w:r>
+        <w:rPr>
+          <w:b/>
+          <w:bCs/>
+          <w:lang w:val="es-CO"/>
+        </w:rPr>
+        <w:t>:</w:t>
+      </w:r>
+      <w:r>
+        <w:rPr>
+          <w:lang w:val="es-CO"/>
+        </w:rPr>
+        <w:t xml:space="preserve"> </w:t>
+      </w:r>
+      <w:r>
+        <w:rPr>
+          <w:lang w:val="es-CO"/>
+        </w:rPr>
+        <w:t xml:space="preserve">Lógica y Captura de datos desde modelo para la realización de CRUDS y </w:t>
+      </w:r>
+      <w:proofErr w:type="spellStart"/>
+      <w:r>
+        <w:rPr>
+          <w:lang w:val="es-CO"/>
+        </w:rPr>
+        <w:t>renderizar</w:t>
+      </w:r>
+      <w:proofErr w:type="spellEnd"/>
+      <w:r>
+        <w:rPr>
+          <w:lang w:val="es-CO"/>
+        </w:rPr>
+        <w:t xml:space="preserve"> a las vistas. </w:t>
       </w:r>
     </w:p>
     <w:p>
@@ -2675,27 +2761,57 @@
           <w:bCs/>
           <w:lang w:val="es-CO"/>
         </w:rPr>
-        <w:t>Módulo de Carrito de Compras y Pedidos:</w:t>
-      </w:r>
-      <w:r>
-        <w:rPr>
-          <w:lang w:val="es-CO"/>
-        </w:rPr>
-        <w:t xml:space="preserve"> Gestión completa del ciclo de compra, desde el carrito hasta la finalización de pedidos, utilizando </w:t>
-      </w:r>
-      <w:proofErr w:type="spellStart"/>
-      <w:r>
-        <w:rPr>
-          <w:lang w:val="es-CO"/>
-        </w:rPr>
-        <w:t>Zustand</w:t>
-      </w:r>
-      <w:proofErr w:type="spellEnd"/>
-      <w:r>
-        <w:rPr>
-          <w:lang w:val="es-CO"/>
-        </w:rPr>
-        <w:t xml:space="preserve"> para el manejo del estado.</w:t>
+        <w:t xml:space="preserve">Archivo </w:t>
+      </w:r>
+      <w:proofErr w:type="spellStart"/>
+      <w:r>
+        <w:rPr>
+          <w:b/>
+          <w:bCs/>
+          <w:lang w:val="es-CO"/>
+        </w:rPr>
+        <w:t>Model</w:t>
+      </w:r>
+      <w:proofErr w:type="spellEnd"/>
+      <w:r>
+        <w:rPr>
+          <w:b/>
+          <w:bCs/>
+          <w:lang w:val="es-CO"/>
+        </w:rPr>
+        <w:t>:</w:t>
+      </w:r>
+      <w:r>
+        <w:rPr>
+          <w:lang w:val="es-CO"/>
+        </w:rPr>
+        <w:t xml:space="preserve"> </w:t>
+      </w:r>
+      <w:r>
+        <w:rPr>
+          <w:lang w:val="es-CO"/>
+        </w:rPr>
+        <w:t xml:space="preserve">Realización de peticiones CRUDS y </w:t>
+      </w:r>
+      <w:proofErr w:type="gramStart"/>
+      <w:r>
+        <w:rPr>
+          <w:lang w:val="es-CO"/>
+        </w:rPr>
+        <w:t>otras funcionabilidad</w:t>
+      </w:r>
+      <w:proofErr w:type="gramEnd"/>
+      <w:r>
+        <w:rPr>
+          <w:lang w:val="es-CO"/>
+        </w:rPr>
+        <w:t xml:space="preserve"> directamente de la base datos para realizar la lógica de negocio</w:t>
+      </w:r>
+      <w:r>
+        <w:rPr>
+          <w:lang w:val="es-CO"/>
+        </w:rPr>
+        <w:t>.</w:t>
       </w:r>
     </w:p>
     <w:p>
@@ -2715,13 +2831,59 @@
           <w:bCs/>
           <w:lang w:val="es-CO"/>
         </w:rPr>
-        <w:t>Módulo de Pagos:</w:t>
-      </w:r>
-      <w:r>
-        <w:rPr>
-          <w:lang w:val="es-CO"/>
-        </w:rPr>
-        <w:t xml:space="preserve"> Integración con la pasarela de pagos Mercado Pago para el procesamiento seguro de todas las transacciones monetarias.</w:t>
+        <w:t>Archivo</w:t>
+      </w:r>
+      <w:r>
+        <w:rPr>
+          <w:b/>
+          <w:bCs/>
+          <w:lang w:val="es-CO"/>
+        </w:rPr>
+        <w:t xml:space="preserve"> </w:t>
+      </w:r>
+      <w:proofErr w:type="spellStart"/>
+      <w:r>
+        <w:rPr>
+          <w:b/>
+          <w:bCs/>
+          <w:lang w:val="es-CO"/>
+        </w:rPr>
+        <w:t>bd</w:t>
+      </w:r>
+      <w:proofErr w:type="spellEnd"/>
+      <w:r>
+        <w:rPr>
+          <w:b/>
+          <w:bCs/>
+          <w:lang w:val="es-CO"/>
+        </w:rPr>
+        <w:t>:</w:t>
+      </w:r>
+      <w:r>
+        <w:rPr>
+          <w:lang w:val="es-CO"/>
+        </w:rPr>
+        <w:t xml:space="preserve"> </w:t>
+      </w:r>
+      <w:r>
+        <w:rPr>
+          <w:lang w:val="es-CO"/>
+        </w:rPr>
+        <w:t>Archivo .</w:t>
+      </w:r>
+      <w:proofErr w:type="spellStart"/>
+      <w:r>
+        <w:rPr>
+          <w:lang w:val="es-CO"/>
+        </w:rPr>
+        <w:t>sql</w:t>
+      </w:r>
+      <w:proofErr w:type="spellEnd"/>
+      <w:r>
+        <w:rPr>
+          <w:lang w:val="es-CO"/>
+        </w:rPr>
+        <w:t xml:space="preserve"> de base datos modelo relacional</w:t>
       </w:r>
     </w:p>
     <w:p>
@@ -2741,31 +2903,87 @@
           <w:bCs/>
           <w:lang w:val="es-CO"/>
         </w:rPr>
-        <w:t>Módulo de Administración (</w:t>
-      </w:r>
-      <w:proofErr w:type="spellStart"/>
-      <w:r>
-        <w:rPr>
-          <w:b/>
-          <w:bCs/>
-          <w:lang w:val="es-CO"/>
-        </w:rPr>
-        <w:t>Dashboard</w:t>
-      </w:r>
-      <w:proofErr w:type="spellEnd"/>
-      <w:r>
-        <w:rPr>
-          <w:b/>
-          <w:bCs/>
-          <w:lang w:val="es-CO"/>
-        </w:rPr>
-        <w:t xml:space="preserve">): </w:t>
-      </w:r>
-      <w:r>
-        <w:rPr>
-          <w:lang w:val="es-CO"/>
-        </w:rPr>
-        <w:t>Una interfaz de gestión interna para que los administradores controlen todos los aspectos de la aplicación.</w:t>
+        <w:t>Archivo</w:t>
+      </w:r>
+      <w:r>
+        <w:rPr>
+          <w:b/>
+          <w:bCs/>
+          <w:lang w:val="es-CO"/>
+        </w:rPr>
+        <w:t xml:space="preserve"> </w:t>
+      </w:r>
+      <w:proofErr w:type="spellStart"/>
+      <w:r>
+        <w:rPr>
+          <w:b/>
+          <w:bCs/>
+          <w:lang w:val="es-CO"/>
+        </w:rPr>
+        <w:t>public</w:t>
+      </w:r>
+      <w:proofErr w:type="spellEnd"/>
+      <w:r>
+        <w:rPr>
+          <w:b/>
+          <w:bCs/>
+          <w:lang w:val="es-CO"/>
+        </w:rPr>
+        <w:t>:</w:t>
+      </w:r>
+      <w:r>
+        <w:rPr>
+          <w:b/>
+          <w:bCs/>
+          <w:lang w:val="es-CO"/>
+        </w:rPr>
+        <w:t xml:space="preserve"> </w:t>
+      </w:r>
+      <w:r>
+        <w:rPr>
+          <w:lang w:val="es-CO"/>
+        </w:rPr>
+        <w:t xml:space="preserve">Interface y </w:t>
+      </w:r>
+      <w:proofErr w:type="gramStart"/>
+      <w:r>
+        <w:rPr>
+          <w:lang w:val="es-CO"/>
+        </w:rPr>
+        <w:t>la do</w:t>
+      </w:r>
+      <w:proofErr w:type="gramEnd"/>
+      <w:r>
+        <w:rPr>
+          <w:lang w:val="es-CO"/>
+        </w:rPr>
+        <w:t xml:space="preserve"> de cliente (JS, CSS)</w:t>
+      </w:r>
+      <w:r>
+        <w:rPr>
+          <w:lang w:val="es-CO"/>
+        </w:rPr>
+        <w:t>.</w:t>
+      </w:r>
+      <w:r>
+        <w:rPr>
+          <w:lang w:val="es-CO"/>
+        </w:rPr>
+        <w:t xml:space="preserve"> Archivo principal donde se arranca el proyecto </w:t>
+      </w:r>
+      <w:proofErr w:type="spellStart"/>
+      <w:r>
+        <w:rPr>
+          <w:lang w:val="es-CO"/>
+        </w:rPr>
+        <w:t>php</w:t>
+      </w:r>
+      <w:proofErr w:type="spellEnd"/>
+      <w:r>
+        <w:rPr>
+          <w:lang w:val="es-CO"/>
+        </w:rPr>
+        <w:t>.</w:t>
       </w:r>
     </w:p>
     <w:p>
@@ -2785,31 +3003,89 @@
           <w:bCs/>
           <w:lang w:val="es-CO"/>
         </w:rPr>
-        <w:t>Módulo de Cursos (E-</w:t>
-      </w:r>
-      <w:proofErr w:type="spellStart"/>
-      <w:r>
-        <w:rPr>
-          <w:b/>
-          <w:bCs/>
-          <w:lang w:val="es-CO"/>
-        </w:rPr>
-        <w:t>learning</w:t>
-      </w:r>
-      <w:proofErr w:type="spellEnd"/>
-      <w:r>
-        <w:rPr>
-          <w:b/>
-          <w:bCs/>
-          <w:lang w:val="es-CO"/>
-        </w:rPr>
-        <w:t>):</w:t>
-      </w:r>
-      <w:r>
-        <w:rPr>
-          <w:lang w:val="es-CO"/>
-        </w:rPr>
-        <w:t xml:space="preserve"> Gestión de cursos, módulos, lecciones, exámenes y seguimiento del progreso del estudiante, con integración de la API de YouTube para contenido de video.</w:t>
+        <w:t>Arc</w:t>
+      </w:r>
+      <w:r>
+        <w:rPr>
+          <w:b/>
+          <w:bCs/>
+          <w:lang w:val="es-CO"/>
+        </w:rPr>
+        <w:t>h</w:t>
+      </w:r>
+      <w:r>
+        <w:rPr>
+          <w:b/>
+          <w:bCs/>
+          <w:lang w:val="es-CO"/>
+        </w:rPr>
+        <w:t>ivo</w:t>
+      </w:r>
+      <w:r>
+        <w:rPr>
+          <w:b/>
+          <w:bCs/>
+          <w:lang w:val="es-CO"/>
+        </w:rPr>
+        <w:t xml:space="preserve"> </w:t>
+      </w:r>
+      <w:proofErr w:type="spellStart"/>
+      <w:r>
+        <w:rPr>
+          <w:b/>
+          <w:bCs/>
+          <w:lang w:val="es-CO"/>
+        </w:rPr>
+        <w:t>vendor</w:t>
+      </w:r>
+      <w:proofErr w:type="spellEnd"/>
+      <w:r>
+        <w:rPr>
+          <w:b/>
+          <w:bCs/>
+          <w:lang w:val="es-CO"/>
+        </w:rPr>
+        <w:t>:</w:t>
+      </w:r>
+      <w:r>
+        <w:rPr>
+          <w:lang w:val="es-CO"/>
+        </w:rPr>
+        <w:t xml:space="preserve"> </w:t>
+      </w:r>
+      <w:r>
+        <w:rPr>
+          <w:lang w:val="es-CO"/>
+        </w:rPr>
+        <w:t>Archivo donde se encuentras las librerías utilizadas en la aplicación (</w:t>
+      </w:r>
+      <w:proofErr w:type="spellStart"/>
+      <w:r>
+        <w:rPr>
+          <w:lang w:val="es-CO"/>
+        </w:rPr>
+        <w:t>phpmailer</w:t>
+      </w:r>
+      <w:proofErr w:type="spellEnd"/>
+      <w:r>
+        <w:rPr>
+          <w:lang w:val="es-CO"/>
+        </w:rPr>
+        <w:t xml:space="preserve"> envíos de correos, </w:t>
+      </w:r>
+      <w:proofErr w:type="spellStart"/>
+      <w:r>
+        <w:rPr>
+          <w:lang w:val="es-CO"/>
+        </w:rPr>
+        <w:t>phpoffice</w:t>
+      </w:r>
+      <w:proofErr w:type="spellEnd"/>
+      <w:r>
+        <w:rPr>
+          <w:lang w:val="es-CO"/>
+        </w:rPr>
+        <w:t xml:space="preserve"> importación de Excel, etc.)</w:t>
       </w:r>
     </w:p>
     <w:p>
@@ -2829,66 +3105,56 @@
           <w:bCs/>
           <w:lang w:val="es-CO"/>
         </w:rPr>
-        <w:t xml:space="preserve">Módulo de Noticias de Moda (Blog): </w:t>
-      </w:r>
-      <w:r>
-        <w:rPr>
-          <w:lang w:val="es-CO"/>
-        </w:rPr>
-        <w:t>Permite la publicación y gestión de artículos y noticias.</w:t>
-      </w:r>
-    </w:p>
-    <w:p>
-      <w:pPr>
-        <w:numPr>
-          <w:ilvl w:val="0"/>
-          <w:numId w:val="2"/>
-        </w:numPr>
+        <w:t xml:space="preserve">Archivo </w:t>
+      </w:r>
+      <w:proofErr w:type="spellStart"/>
+      <w:r>
+        <w:rPr>
+          <w:b/>
+          <w:bCs/>
+          <w:lang w:val="es-CO"/>
+        </w:rPr>
+        <w:t>Dockerfile</w:t>
+      </w:r>
+      <w:proofErr w:type="spellEnd"/>
+      <w:r>
+        <w:rPr>
+          <w:b/>
+          <w:bCs/>
+          <w:lang w:val="es-CO"/>
+        </w:rPr>
+        <w:t>:</w:t>
+      </w:r>
+      <w:r>
+        <w:rPr>
+          <w:b/>
+          <w:bCs/>
+          <w:lang w:val="es-CO"/>
+        </w:rPr>
+        <w:t xml:space="preserve"> </w:t>
+      </w:r>
+      <w:r>
+        <w:rPr>
+          <w:lang w:val="es-CO"/>
+        </w:rPr>
+        <w:t>Para el despliegue del sistema.</w:t>
+      </w:r>
+    </w:p>
+    <w:p>
+      <w:pPr>
         <w:spacing w:before="240" w:after="240"/>
         <w:rPr>
           <w:lang w:val="es-CO"/>
         </w:rPr>
       </w:pPr>
-      <w:r>
-        <w:rPr>
-          <w:b/>
-          <w:bCs/>
-          <w:lang w:val="es-CO"/>
-        </w:rPr>
-        <w:t>Módulo de Foro y Comunidad:</w:t>
-      </w:r>
-      <w:r>
-        <w:rPr>
-          <w:lang w:val="es-CO"/>
-        </w:rPr>
-        <w:t xml:space="preserve"> Facilita la interacción entre usuarios a través de un foro con temas y publicaciones.</w:t>
-      </w:r>
-    </w:p>
-    <w:p>
-      <w:pPr>
-        <w:numPr>
-          <w:ilvl w:val="0"/>
-          <w:numId w:val="2"/>
-        </w:numPr>
+    </w:p>
+    <w:p>
+      <w:pPr>
         <w:spacing w:before="240" w:after="240"/>
         <w:rPr>
           <w:lang w:val="es-CO"/>
         </w:rPr>
       </w:pPr>
-      <w:r>
-        <w:rPr>
-          <w:b/>
-          <w:bCs/>
-          <w:lang w:val="es-CO"/>
-        </w:rPr>
-        <w:t>Módulos de Contenido y Soporte:</w:t>
-      </w:r>
-      <w:r>
-        <w:rPr>
-          <w:lang w:val="es-CO"/>
-        </w:rPr>
-        <w:t xml:space="preserve"> Incluye la gestión de banners promocionales y un sistema de Peticiones, Quejas, Reclamos y Sugerencias (PQRS).</w:t>
-      </w:r>
     </w:p>
     <w:p>
       <w:pPr>
@@ -2929,6 +3195,16 @@
           <w:lang w:val="es-CO"/>
         </w:rPr>
       </w:pPr>
+    </w:p>
+    <w:p>
+      <w:pPr>
+        <w:spacing w:before="240" w:after="240"/>
+        <w:rPr>
+          <w:lang w:val="es-CO"/>
+        </w:rPr>
+      </w:pPr>
+      <w:bookmarkStart w:id="16" w:name="_GoBack"/>
+      <w:bookmarkEnd w:id="16"/>
     </w:p>
     <w:p>
       <w:pPr>
@@ -2945,6 +3221,7 @@
         <w:rPr>
           <w:lang w:val="es-CO"/>
         </w:rPr>
+        <w:lastRenderedPageBreak/>
         <w:t>4. Ámbito de la Aplicación</w:t>
       </w:r>
     </w:p>
@@ -3696,7 +3973,14 @@
         <w:rPr>
           <w:lang w:val="es-CO"/>
         </w:rPr>
-        <w:t xml:space="preserve">, está diseñada para ser modular y escalable, con una clara separación de responsabilidades entre sus componentes principales. La elección de Next.js como </w:t>
+        <w:t xml:space="preserve">, está diseñada para ser modular y escalable, con una clara separación de responsabilidades </w:t>
+      </w:r>
+      <w:r>
+        <w:rPr>
+          <w:lang w:val="es-CO"/>
+        </w:rPr>
+        <w:lastRenderedPageBreak/>
+        <w:t xml:space="preserve">entre sus componentes principales. La elección de Next.js como </w:t>
       </w:r>
       <w:proofErr w:type="spellStart"/>
       <w:r>
@@ -4309,105 +4593,105 @@
           <w:bCs/>
           <w:lang w:val="es-CO"/>
         </w:rPr>
+        <w:t>MercadoPago</w:t>
+      </w:r>
+      <w:proofErr w:type="spellEnd"/>
+      <w:r>
+        <w:rPr>
+          <w:b/>
+          <w:bCs/>
+          <w:lang w:val="es-CO"/>
+        </w:rPr>
+        <w:t>:</w:t>
+      </w:r>
+      <w:r>
+        <w:rPr>
+          <w:lang w:val="es-CO"/>
+        </w:rPr>
+        <w:t xml:space="preserve"> Es la pasarela de pagos seleccionada para procesar todas las transacciones monetarias dentro del Tienda, ofreciendo una integración segura y eficiente. </w:t>
+      </w:r>
+    </w:p>
+    <w:p>
+      <w:pPr>
+        <w:rPr>
+          <w:lang w:val="es-CO"/>
+        </w:rPr>
+      </w:pPr>
+      <w:proofErr w:type="spellStart"/>
+      <w:r>
+        <w:rPr>
+          <w:b/>
+          <w:bCs/>
+          <w:lang w:val="es-CO"/>
+        </w:rPr>
+        <w:t>UploadThing</w:t>
+      </w:r>
+      <w:proofErr w:type="spellEnd"/>
+      <w:r>
+        <w:rPr>
+          <w:b/>
+          <w:bCs/>
+          <w:lang w:val="es-CO"/>
+        </w:rPr>
+        <w:t>:</w:t>
+      </w:r>
+      <w:r>
+        <w:rPr>
+          <w:lang w:val="es-CO"/>
+        </w:rPr>
+        <w:t xml:space="preserve"> Utilizado para la gestión de la subida y el almacenamiento de archivos e imágenes, optimizando el manejo de contenido multimedia. </w:t>
+      </w:r>
+    </w:p>
+    <w:p>
+      <w:pPr>
+        <w:rPr>
+          <w:lang w:val="es-CO"/>
+        </w:rPr>
+      </w:pPr>
+    </w:p>
+    <w:p>
+      <w:pPr>
+        <w:rPr>
+          <w:lang w:val="es-CO"/>
+        </w:rPr>
+      </w:pPr>
+      <w:proofErr w:type="spellStart"/>
+      <w:r>
+        <w:rPr>
+          <w:b/>
+          <w:bCs/>
+          <w:lang w:val="es-CO"/>
+        </w:rPr>
+        <w:t>Resend</w:t>
+      </w:r>
+      <w:proofErr w:type="spellEnd"/>
+      <w:r>
+        <w:rPr>
+          <w:lang w:val="es-CO"/>
+        </w:rPr>
+        <w:t xml:space="preserve">: Empleado para el envío de correos electrónicos transaccionales, como confirmaciones de pedidos, notificaciones de cuenta y restablecimiento de contraseñas. </w:t>
+      </w:r>
+    </w:p>
+    <w:p>
+      <w:pPr>
+        <w:rPr>
+          <w:lang w:val="es-CO"/>
+        </w:rPr>
+      </w:pPr>
+    </w:p>
+    <w:p>
+      <w:pPr>
+        <w:rPr>
+          <w:lang w:val="es-CO"/>
+        </w:rPr>
+      </w:pPr>
+      <w:r>
+        <w:rPr>
+          <w:b/>
+          <w:bCs/>
+          <w:lang w:val="es-CO"/>
+        </w:rPr>
         <w:lastRenderedPageBreak/>
-        <w:t>MercadoPago</w:t>
-      </w:r>
-      <w:proofErr w:type="spellEnd"/>
-      <w:r>
-        <w:rPr>
-          <w:b/>
-          <w:bCs/>
-          <w:lang w:val="es-CO"/>
-        </w:rPr>
-        <w:t>:</w:t>
-      </w:r>
-      <w:r>
-        <w:rPr>
-          <w:lang w:val="es-CO"/>
-        </w:rPr>
-        <w:t xml:space="preserve"> Es la pasarela de pagos seleccionada para procesar todas las transacciones monetarias dentro del Tienda, ofreciendo una integración segura y eficiente. </w:t>
-      </w:r>
-    </w:p>
-    <w:p>
-      <w:pPr>
-        <w:rPr>
-          <w:lang w:val="es-CO"/>
-        </w:rPr>
-      </w:pPr>
-      <w:proofErr w:type="spellStart"/>
-      <w:r>
-        <w:rPr>
-          <w:b/>
-          <w:bCs/>
-          <w:lang w:val="es-CO"/>
-        </w:rPr>
-        <w:t>UploadThing</w:t>
-      </w:r>
-      <w:proofErr w:type="spellEnd"/>
-      <w:r>
-        <w:rPr>
-          <w:b/>
-          <w:bCs/>
-          <w:lang w:val="es-CO"/>
-        </w:rPr>
-        <w:t>:</w:t>
-      </w:r>
-      <w:r>
-        <w:rPr>
-          <w:lang w:val="es-CO"/>
-        </w:rPr>
-        <w:t xml:space="preserve"> Utilizado para la gestión de la subida y el almacenamiento de archivos e imágenes, optimizando el manejo de contenido multimedia. </w:t>
-      </w:r>
-    </w:p>
-    <w:p>
-      <w:pPr>
-        <w:rPr>
-          <w:lang w:val="es-CO"/>
-        </w:rPr>
-      </w:pPr>
-    </w:p>
-    <w:p>
-      <w:pPr>
-        <w:rPr>
-          <w:lang w:val="es-CO"/>
-        </w:rPr>
-      </w:pPr>
-      <w:proofErr w:type="spellStart"/>
-      <w:r>
-        <w:rPr>
-          <w:b/>
-          <w:bCs/>
-          <w:lang w:val="es-CO"/>
-        </w:rPr>
-        <w:t>Resend</w:t>
-      </w:r>
-      <w:proofErr w:type="spellEnd"/>
-      <w:r>
-        <w:rPr>
-          <w:lang w:val="es-CO"/>
-        </w:rPr>
-        <w:t xml:space="preserve">: Empleado para el envío de correos electrónicos transaccionales, como confirmaciones de pedidos, notificaciones de cuenta y restablecimiento de contraseñas. </w:t>
-      </w:r>
-    </w:p>
-    <w:p>
-      <w:pPr>
-        <w:rPr>
-          <w:lang w:val="es-CO"/>
-        </w:rPr>
-      </w:pPr>
-    </w:p>
-    <w:p>
-      <w:pPr>
-        <w:rPr>
-          <w:lang w:val="es-CO"/>
-        </w:rPr>
-      </w:pPr>
-      <w:r>
-        <w:rPr>
-          <w:b/>
-          <w:bCs/>
-          <w:lang w:val="es-CO"/>
-        </w:rPr>
         <w:t>YouTube API:</w:t>
       </w:r>
       <w:r>
@@ -4628,19 +4912,17 @@
         <w:widowControl w:val="0"/>
         <w:spacing w:before="587"/>
         <w:ind w:left="9"/>
+        <w:rPr>
+          <w:lang w:val="es-CO"/>
+        </w:rPr>
       </w:pPr>
       <w:bookmarkStart w:id="25" w:name="_wcnljtnvj5tw" w:colFirst="0" w:colLast="0"/>
       <w:bookmarkEnd w:id="25"/>
       <w:r>
-        <w:t xml:space="preserve">6.  </w:t>
-      </w:r>
-      <w:proofErr w:type="spellStart"/>
-      <w:r>
-        <w:t>Estructura</w:t>
-      </w:r>
-      <w:proofErr w:type="spellEnd"/>
-      <w:r>
-        <w:t xml:space="preserve"> del Proyecto </w:t>
+        <w:rPr>
+          <w:lang w:val="es-CO"/>
+        </w:rPr>
+        <w:t xml:space="preserve">6.  Estructura del Proyecto </w:t>
       </w:r>
     </w:p>
     <w:p>
@@ -5766,20 +6048,18 @@
         <w:widowControl w:val="0"/>
         <w:spacing w:before="580"/>
         <w:ind w:left="7"/>
+        <w:rPr>
+          <w:lang w:val="es-CO"/>
+        </w:rPr>
       </w:pPr>
       <w:bookmarkStart w:id="26" w:name="_bhfx82l7fu5x" w:colFirst="0" w:colLast="0"/>
       <w:bookmarkEnd w:id="26"/>
       <w:r>
+        <w:rPr>
+          <w:lang w:val="es-CO"/>
+        </w:rPr>
         <w:lastRenderedPageBreak/>
-        <w:t xml:space="preserve">7.  </w:t>
-      </w:r>
-      <w:proofErr w:type="spellStart"/>
-      <w:r>
-        <w:t>Dependencias</w:t>
-      </w:r>
-      <w:proofErr w:type="spellEnd"/>
-      <w:r>
-        <w:t xml:space="preserve"> Clave </w:t>
+        <w:t xml:space="preserve">7.  Dependencias Clave </w:t>
       </w:r>
     </w:p>
     <w:p>
@@ -15394,6 +15674,7 @@
   <w:style w:type="character" w:default="1" w:styleId="Fuentedeprrafopredeter">
     <w:name w:val="Default Paragraph Font"/>
     <w:uiPriority w:val="1"/>
+    <w:semiHidden/>
     <w:unhideWhenUsed/>
   </w:style>
   <w:style w:type="table" w:default="1" w:styleId="Tablanormal">

</xml_diff>

<commit_message>
Seccion # 6 estructura del proyecto Finalizada
</commit_message>
<xml_diff>
--- a/Manual Técnico Sena Contigo.docx
+++ b/Manual Técnico Sena Contigo.docx
@@ -3235,13 +3235,7 @@
         <w:rPr>
           <w:lang w:val="es-CO"/>
         </w:rPr>
-        <w:t xml:space="preserve">El proyecto </w:t>
-      </w:r>
-      <w:r>
-        <w:rPr>
-          <w:lang w:val="es-CO"/>
-        </w:rPr>
-        <w:t>Sena Contigo: Plataforma de Apoyo y Retención de Aprendices</w:t>
+        <w:t>El proyecto Sena Contigo: Plataforma de Apoyo y Retención de Aprendices</w:t>
       </w:r>
       <w:r>
         <w:rPr>
@@ -3797,7 +3791,21 @@
         <w:rPr>
           <w:lang w:val="es-CO"/>
         </w:rPr>
-        <w:t>Para el envió de correros del sistema</w:t>
+        <w:t xml:space="preserve">Para </w:t>
+      </w:r>
+      <w:proofErr w:type="spellStart"/>
+      <w:r>
+        <w:rPr>
+          <w:lang w:val="es-CO"/>
+        </w:rPr>
+        <w:t>el</w:t>
+      </w:r>
+      <w:proofErr w:type="spellEnd"/>
+      <w:r>
+        <w:rPr>
+          <w:lang w:val="es-CO"/>
+        </w:rPr>
+        <w:t xml:space="preserve"> envió de correros del sistema</w:t>
       </w:r>
       <w:r>
         <w:rPr>
@@ -4460,7 +4468,7 @@
       </w:pPr>
       <w:r>
         <w:rPr>
-          <w:lang w:val="es-CO"/>
+          <w:noProof/>
         </w:rPr>
         <w:drawing>
           <wp:inline distT="0" distB="0" distL="0" distR="0" wp14:anchorId="15B1F730" wp14:editId="0720478B">
@@ -4519,15 +4527,7 @@
         <w:rPr>
           <w:lang w:val="es-CO"/>
         </w:rPr>
-        <w:t>Explicació</w:t>
-      </w:r>
-      <w:bookmarkStart w:id="21" w:name="_GoBack"/>
-      <w:bookmarkEnd w:id="21"/>
-      <w:r>
-        <w:rPr>
-          <w:lang w:val="es-CO"/>
-        </w:rPr>
-        <w:t>n del Diagrama</w:t>
+        <w:t>Explicación del Diagrama</w:t>
       </w:r>
     </w:p>
     <w:p>
@@ -5108,10 +5108,10 @@
           <w:lang w:val="es-CO"/>
         </w:rPr>
       </w:pPr>
-      <w:bookmarkStart w:id="22" w:name="_ar9j33b82web" w:colFirst="0" w:colLast="0"/>
-      <w:bookmarkStart w:id="23" w:name="_3s82641gmchl" w:colFirst="0" w:colLast="0"/>
+      <w:bookmarkStart w:id="21" w:name="_ar9j33b82web" w:colFirst="0" w:colLast="0"/>
+      <w:bookmarkStart w:id="22" w:name="_3s82641gmchl" w:colFirst="0" w:colLast="0"/>
+      <w:bookmarkEnd w:id="21"/>
       <w:bookmarkEnd w:id="22"/>
-      <w:bookmarkEnd w:id="23"/>
       <w:r>
         <w:rPr>
           <w:lang w:val="es-CO"/>
@@ -5230,8 +5230,8 @@
           <w:lang w:val="es-CO"/>
         </w:rPr>
       </w:pPr>
-      <w:bookmarkStart w:id="24" w:name="_9alqlnjyqpm" w:colFirst="0" w:colLast="0"/>
-      <w:bookmarkEnd w:id="24"/>
+      <w:bookmarkStart w:id="23" w:name="_9alqlnjyqpm" w:colFirst="0" w:colLast="0"/>
+      <w:bookmarkEnd w:id="23"/>
     </w:p>
     <w:p>
       <w:pPr>
@@ -5243,76 +5243,14 @@
           <w:lang w:val="es-CO"/>
         </w:rPr>
       </w:pPr>
-      <w:bookmarkStart w:id="25" w:name="_wcnljtnvj5tw" w:colFirst="0" w:colLast="0"/>
-      <w:bookmarkEnd w:id="25"/>
+      <w:bookmarkStart w:id="24" w:name="_wcnljtnvj5tw" w:colFirst="0" w:colLast="0"/>
+      <w:bookmarkEnd w:id="24"/>
       <w:r>
         <w:rPr>
           <w:lang w:val="es-CO"/>
         </w:rPr>
         <w:t xml:space="preserve">6.  Estructura del Proyecto </w:t>
       </w:r>
-    </w:p>
-    <w:p>
-      <w:pPr>
-        <w:rPr>
-          <w:lang w:val="es-CO"/>
-        </w:rPr>
-      </w:pPr>
-      <w:r>
-        <w:rPr>
-          <w:lang w:val="es-CO"/>
-        </w:rPr>
-        <w:t xml:space="preserve">El proyecto </w:t>
-      </w:r>
-      <w:proofErr w:type="spellStart"/>
-      <w:r>
-        <w:rPr>
-          <w:lang w:val="es-CO"/>
-        </w:rPr>
-        <w:t>NombreProyecto</w:t>
-      </w:r>
-      <w:proofErr w:type="spellEnd"/>
-      <w:r>
-        <w:rPr>
-          <w:lang w:val="es-CO"/>
-        </w:rPr>
-        <w:t xml:space="preserve"> adopta una estructura de directorios organizada y modular, diseñada para separar responsabilidades, facilitar la navegación y promover la mantenibilidad del código. Esta organización es crucial para un proyecto de la envergadura de </w:t>
-      </w:r>
-      <w:proofErr w:type="spellStart"/>
-      <w:r>
-        <w:rPr>
-          <w:lang w:val="es-CO"/>
-        </w:rPr>
-        <w:t>NombreProyecto</w:t>
-      </w:r>
-      <w:proofErr w:type="spellEnd"/>
-      <w:r>
-        <w:rPr>
-          <w:lang w:val="es-CO"/>
-        </w:rPr>
-        <w:t xml:space="preserve">, que combina funcionalidades de Tienda y </w:t>
-      </w:r>
-      <w:proofErr w:type="spellStart"/>
-      <w:r>
-        <w:rPr>
-          <w:lang w:val="es-CO"/>
-        </w:rPr>
-        <w:t>learning</w:t>
-      </w:r>
-      <w:proofErr w:type="spellEnd"/>
-      <w:r>
-        <w:rPr>
-          <w:lang w:val="es-CO"/>
-        </w:rPr>
-        <w:t>.</w:t>
-      </w:r>
-    </w:p>
-    <w:p>
-      <w:pPr>
-        <w:rPr>
-          <w:lang w:val="es-CO"/>
-        </w:rPr>
-      </w:pPr>
     </w:p>
     <w:p>
       <w:pPr>
@@ -5325,7 +5263,87 @@
           <w:between w:val="nil"/>
         </w:pBdr>
         <w:spacing w:line="240" w:lineRule="auto"/>
-        <w:ind w:left="297"/>
+        <w:ind w:left="9"/>
+        <w:rPr>
+          <w:lang w:val="es-CO"/>
+        </w:rPr>
+      </w:pPr>
+      <w:r>
+        <w:rPr>
+          <w:lang w:val="es-CO"/>
+        </w:rPr>
+        <w:t>El proyecto SENA Contigo adopta una estructura de directorios organizada y modular basada en el patrón de arquitectura MVC (Modelo – Vista – Controlador). Esta estructura permite separar claramente las responsabilidades de cada componente del sistema, facilitando el mantenimiento, la escalabilidad y la comprensión del código por parte de los desarrolladores.</w:t>
+      </w:r>
+    </w:p>
+    <w:p>
+      <w:pPr>
+        <w:widowControl w:val="0"/>
+        <w:pBdr>
+          <w:top w:val="nil"/>
+          <w:left w:val="nil"/>
+          <w:bottom w:val="nil"/>
+          <w:right w:val="nil"/>
+          <w:between w:val="nil"/>
+        </w:pBdr>
+        <w:spacing w:line="240" w:lineRule="auto"/>
+        <w:ind w:left="9"/>
+        <w:rPr>
+          <w:lang w:val="es-CO"/>
+        </w:rPr>
+      </w:pPr>
+    </w:p>
+    <w:p>
+      <w:pPr>
+        <w:widowControl w:val="0"/>
+        <w:pBdr>
+          <w:top w:val="nil"/>
+          <w:left w:val="nil"/>
+          <w:bottom w:val="nil"/>
+          <w:right w:val="nil"/>
+          <w:between w:val="nil"/>
+        </w:pBdr>
+        <w:spacing w:line="240" w:lineRule="auto"/>
+        <w:ind w:left="9"/>
+        <w:rPr>
+          <w:lang w:val="es-CO"/>
+        </w:rPr>
+      </w:pPr>
+      <w:r>
+        <w:rPr>
+          <w:lang w:val="es-CO"/>
+        </w:rPr>
+        <w:t>La organización del proyecto está diseñada para soportar el desarrollo de una aplicación web robusta orientada a la gestión, seguimiento e intervención de aprendices en riesgo de deserción, permitiendo que cada capa del sistema cumpla una función específica dentro de la arquitectura.</w:t>
+      </w:r>
+    </w:p>
+    <w:p>
+      <w:pPr>
+        <w:widowControl w:val="0"/>
+        <w:pBdr>
+          <w:top w:val="nil"/>
+          <w:left w:val="nil"/>
+          <w:bottom w:val="nil"/>
+          <w:right w:val="nil"/>
+          <w:between w:val="nil"/>
+        </w:pBdr>
+        <w:spacing w:line="240" w:lineRule="auto"/>
+        <w:ind w:left="9"/>
+        <w:rPr>
+          <w:lang w:val="es-CO"/>
+        </w:rPr>
+      </w:pPr>
+    </w:p>
+    <w:p>
+      <w:pPr>
+        <w:widowControl w:val="0"/>
+        <w:pBdr>
+          <w:top w:val="nil"/>
+          <w:left w:val="nil"/>
+          <w:bottom w:val="nil"/>
+          <w:right w:val="nil"/>
+          <w:between w:val="nil"/>
+        </w:pBdr>
+        <w:spacing w:line="240" w:lineRule="auto"/>
+        <w:ind w:left="9"/>
         <w:rPr>
           <w:color w:val="333333"/>
           <w:sz w:val="19"/>
@@ -5335,46 +5353,72 @@
       </w:pPr>
       <w:r>
         <w:rPr>
+          <w:lang w:val="es-CO"/>
+        </w:rPr>
+        <w:t xml:space="preserve">A continuación se presenta la estructura principal del </w:t>
+      </w:r>
+      <w:proofErr w:type="gramStart"/>
+      <w:r>
+        <w:rPr>
+          <w:lang w:val="es-CO"/>
+        </w:rPr>
+        <w:t>proyecto:</w:t>
+      </w:r>
+      <w:r>
+        <w:rPr>
           <w:color w:val="333333"/>
           <w:sz w:val="19"/>
           <w:szCs w:val="19"/>
           <w:lang w:val="es-CO"/>
         </w:rPr>
-        <w:t xml:space="preserve">. </w:t>
-      </w:r>
-    </w:p>
-    <w:p>
-      <w:pPr>
-        <w:rPr>
-          <w:lang w:val="es-CO"/>
-        </w:rPr>
-      </w:pPr>
-      <w:r>
-        <w:rPr>
-          <w:lang w:val="es-CO"/>
-        </w:rPr>
-        <w:t>proyecto-</w:t>
-      </w:r>
-      <w:proofErr w:type="spellStart"/>
-      <w:r>
-        <w:rPr>
-          <w:lang w:val="es-CO"/>
-        </w:rPr>
-        <w:t>ecommerce</w:t>
-      </w:r>
-      <w:proofErr w:type="spellEnd"/>
-      <w:r>
-        <w:rPr>
-          <w:lang w:val="es-CO"/>
-        </w:rPr>
-        <w:t>-</w:t>
-      </w:r>
-      <w:proofErr w:type="spellStart"/>
-      <w:r>
-        <w:rPr>
-          <w:lang w:val="es-CO"/>
-        </w:rPr>
-        <w:t>elearning</w:t>
+        <w:t>.</w:t>
+      </w:r>
+      <w:proofErr w:type="gramEnd"/>
+      <w:r>
+        <w:rPr>
+          <w:color w:val="333333"/>
+          <w:sz w:val="19"/>
+          <w:szCs w:val="19"/>
+          <w:lang w:val="es-CO"/>
+        </w:rPr>
+        <w:t xml:space="preserve"> </w:t>
+      </w:r>
+    </w:p>
+    <w:p>
+      <w:pPr>
+        <w:widowControl w:val="0"/>
+        <w:pBdr>
+          <w:top w:val="nil"/>
+          <w:left w:val="nil"/>
+          <w:bottom w:val="nil"/>
+          <w:right w:val="nil"/>
+          <w:between w:val="nil"/>
+        </w:pBdr>
+        <w:spacing w:line="240" w:lineRule="auto"/>
+        <w:ind w:left="9"/>
+        <w:rPr>
+          <w:color w:val="333333"/>
+          <w:sz w:val="19"/>
+          <w:szCs w:val="19"/>
+          <w:lang w:val="es-CO"/>
+        </w:rPr>
+      </w:pPr>
+    </w:p>
+    <w:p>
+      <w:pPr>
+        <w:widowControl w:val="0"/>
+        <w:spacing w:line="324" w:lineRule="auto"/>
+        <w:ind w:left="18" w:right="-14" w:firstLine="5"/>
+        <w:rPr>
+          <w:lang w:val="es-CO"/>
+        </w:rPr>
+      </w:pPr>
+      <w:proofErr w:type="spellStart"/>
+      <w:r>
+        <w:rPr>
+          <w:lang w:val="es-CO"/>
+        </w:rPr>
+        <w:t>projectRetencion</w:t>
       </w:r>
       <w:proofErr w:type="spellEnd"/>
       <w:r>
@@ -5386,69 +5430,207 @@
     </w:p>
     <w:p>
       <w:pPr>
-        <w:rPr>
-          <w:lang w:val="es-CO"/>
-        </w:rPr>
-      </w:pPr>
-      <w:r>
-        <w:rPr>
-          <w:lang w:val="es-CO"/>
-        </w:rPr>
-        <w:t xml:space="preserve">├── [archivos de configuración]         </w:t>
-      </w:r>
-      <w:proofErr w:type="gramStart"/>
-      <w:r>
-        <w:rPr>
-          <w:lang w:val="es-CO"/>
-        </w:rPr>
-        <w:t># .</w:t>
-      </w:r>
-      <w:proofErr w:type="spellStart"/>
-      <w:r>
-        <w:rPr>
-          <w:lang w:val="es-CO"/>
-        </w:rPr>
-        <w:t>env</w:t>
-      </w:r>
-      <w:proofErr w:type="spellEnd"/>
-      <w:proofErr w:type="gramEnd"/>
-      <w:r>
-        <w:rPr>
-          <w:lang w:val="es-CO"/>
-        </w:rPr>
-        <w:t xml:space="preserve">, </w:t>
-      </w:r>
-      <w:proofErr w:type="spellStart"/>
-      <w:r>
-        <w:rPr>
-          <w:lang w:val="es-CO"/>
-        </w:rPr>
-        <w:t>package.json</w:t>
-      </w:r>
-      <w:proofErr w:type="spellEnd"/>
-      <w:r>
-        <w:rPr>
-          <w:lang w:val="es-CO"/>
-        </w:rPr>
-        <w:t xml:space="preserve">, </w:t>
-      </w:r>
-      <w:proofErr w:type="spellStart"/>
-      <w:r>
-        <w:rPr>
-          <w:lang w:val="es-CO"/>
-        </w:rPr>
-        <w:t>next.config.mjs</w:t>
-      </w:r>
-      <w:proofErr w:type="spellEnd"/>
-      <w:r>
-        <w:rPr>
-          <w:lang w:val="es-CO"/>
-        </w:rPr>
-        <w:t>, etc.</w:t>
-      </w:r>
-    </w:p>
-    <w:p>
-      <w:pPr>
+        <w:widowControl w:val="0"/>
+        <w:spacing w:line="324" w:lineRule="auto"/>
+        <w:ind w:left="18" w:right="-14" w:firstLine="5"/>
+        <w:rPr>
+          <w:lang w:val="es-CO"/>
+        </w:rPr>
+      </w:pPr>
+      <w:r>
+        <w:rPr>
+          <w:lang w:val="es-CO"/>
+        </w:rPr>
+        <w:t>├── app/</w:t>
+      </w:r>
+    </w:p>
+    <w:p>
+      <w:pPr>
+        <w:widowControl w:val="0"/>
+        <w:spacing w:line="324" w:lineRule="auto"/>
+        <w:ind w:left="18" w:right="-14" w:firstLine="5"/>
+        <w:rPr>
+          <w:lang w:val="es-CO"/>
+        </w:rPr>
+      </w:pPr>
+      <w:r>
+        <w:rPr>
+          <w:lang w:val="es-CO"/>
+        </w:rPr>
+        <w:t xml:space="preserve">│   ├── </w:t>
+      </w:r>
+      <w:proofErr w:type="spellStart"/>
+      <w:r>
+        <w:rPr>
+          <w:lang w:val="es-CO"/>
+        </w:rPr>
+        <w:t>config</w:t>
+      </w:r>
+      <w:proofErr w:type="spellEnd"/>
+      <w:r>
+        <w:rPr>
+          <w:lang w:val="es-CO"/>
+        </w:rPr>
+        <w:t xml:space="preserve">/            </w:t>
+      </w:r>
+      <w:r>
+        <w:rPr>
+          <w:sz w:val="20"/>
+          <w:szCs w:val="20"/>
+          <w:lang w:val="es-CO"/>
+        </w:rPr>
+        <w:t># Archivos de configuración del sistema (conexión a BD, variables globales)</w:t>
+      </w:r>
+    </w:p>
+    <w:p>
+      <w:pPr>
+        <w:widowControl w:val="0"/>
+        <w:spacing w:line="324" w:lineRule="auto"/>
+        <w:ind w:left="18" w:right="-14" w:firstLine="5"/>
+        <w:rPr>
+          <w:lang w:val="es-CO"/>
+        </w:rPr>
+      </w:pPr>
+      <w:r>
+        <w:rPr>
+          <w:lang w:val="es-CO"/>
+        </w:rPr>
+        <w:t xml:space="preserve">│   ├── </w:t>
+      </w:r>
+      <w:proofErr w:type="spellStart"/>
+      <w:r>
+        <w:rPr>
+          <w:lang w:val="es-CO"/>
+        </w:rPr>
+        <w:t>controllers</w:t>
+      </w:r>
+      <w:proofErr w:type="spellEnd"/>
+      <w:r>
+        <w:rPr>
+          <w:lang w:val="es-CO"/>
+        </w:rPr>
+        <w:t xml:space="preserve">/       </w:t>
+      </w:r>
+      <w:r>
+        <w:rPr>
+          <w:sz w:val="22"/>
+          <w:szCs w:val="22"/>
+          <w:lang w:val="es-CO"/>
+        </w:rPr>
+        <w:t># Controladores que gestionan las solicitudes del usuario</w:t>
+      </w:r>
+    </w:p>
+    <w:p>
+      <w:pPr>
+        <w:widowControl w:val="0"/>
+        <w:spacing w:line="324" w:lineRule="auto"/>
+        <w:ind w:left="18" w:right="-14" w:firstLine="5"/>
+        <w:rPr>
+          <w:lang w:val="es-CO"/>
+        </w:rPr>
+      </w:pPr>
+      <w:r>
+        <w:rPr>
+          <w:lang w:val="es-CO"/>
+        </w:rPr>
+        <w:t xml:space="preserve">│   ├── </w:t>
+      </w:r>
+      <w:proofErr w:type="spellStart"/>
+      <w:r>
+        <w:rPr>
+          <w:lang w:val="es-CO"/>
+        </w:rPr>
+        <w:t>libraries</w:t>
+      </w:r>
+      <w:proofErr w:type="spellEnd"/>
+      <w:r>
+        <w:rPr>
+          <w:lang w:val="es-CO"/>
+        </w:rPr>
+        <w:t>/         # Librerías o clases auxiliares reutilizables</w:t>
+      </w:r>
+    </w:p>
+    <w:p>
+      <w:pPr>
+        <w:widowControl w:val="0"/>
+        <w:spacing w:line="324" w:lineRule="auto"/>
+        <w:ind w:left="18" w:right="-14" w:firstLine="5"/>
+        <w:rPr>
+          <w:lang w:val="es-CO"/>
+        </w:rPr>
+      </w:pPr>
+      <w:r>
+        <w:rPr>
+          <w:lang w:val="es-CO"/>
+        </w:rPr>
+        <w:t xml:space="preserve">│   ├── </w:t>
+      </w:r>
+      <w:proofErr w:type="spellStart"/>
+      <w:r>
+        <w:rPr>
+          <w:lang w:val="es-CO"/>
+        </w:rPr>
+        <w:t>models</w:t>
+      </w:r>
+      <w:proofErr w:type="spellEnd"/>
+      <w:r>
+        <w:rPr>
+          <w:lang w:val="es-CO"/>
+        </w:rPr>
+        <w:t xml:space="preserve">/            </w:t>
+      </w:r>
+      <w:r>
+        <w:rPr>
+          <w:sz w:val="22"/>
+          <w:szCs w:val="22"/>
+          <w:lang w:val="es-CO"/>
+        </w:rPr>
+        <w:t># Modelos encargados de la lógica de negocio y acceso a datos</w:t>
+      </w:r>
+    </w:p>
+    <w:p>
+      <w:pPr>
+        <w:widowControl w:val="0"/>
+        <w:spacing w:line="324" w:lineRule="auto"/>
+        <w:ind w:left="18" w:right="-14" w:firstLine="5"/>
+        <w:rPr>
+          <w:lang w:val="es-CO"/>
+        </w:rPr>
+      </w:pPr>
+      <w:r>
+        <w:rPr>
+          <w:lang w:val="es-CO"/>
+        </w:rPr>
+        <w:t xml:space="preserve">│   └── </w:t>
+      </w:r>
+      <w:proofErr w:type="spellStart"/>
+      <w:r>
+        <w:rPr>
+          <w:lang w:val="es-CO"/>
+        </w:rPr>
+        <w:t>views</w:t>
+      </w:r>
+      <w:proofErr w:type="spellEnd"/>
+      <w:r>
+        <w:rPr>
+          <w:lang w:val="es-CO"/>
+        </w:rPr>
+        <w:t xml:space="preserve">/             </w:t>
+      </w:r>
+      <w:r>
+        <w:rPr>
+          <w:sz w:val="22"/>
+          <w:szCs w:val="22"/>
+          <w:lang w:val="es-CO"/>
+        </w:rPr>
+        <w:t># Vistas que contienen la interfaz de usuario</w:t>
+      </w:r>
+    </w:p>
+    <w:p>
+      <w:pPr>
+        <w:widowControl w:val="0"/>
+        <w:spacing w:line="324" w:lineRule="auto"/>
+        <w:ind w:left="18" w:right="-14" w:firstLine="5"/>
         <w:rPr>
           <w:lang w:val="es-CO"/>
         </w:rPr>
@@ -5462,19 +5644,85 @@
     </w:p>
     <w:p>
       <w:pPr>
-        <w:rPr>
-          <w:lang w:val="es-CO"/>
-        </w:rPr>
-      </w:pPr>
-      <w:r>
-        <w:rPr>
-          <w:lang w:val="es-CO"/>
-        </w:rPr>
-        <w:t>├── prisma/                             # Base de datos</w:t>
-      </w:r>
-    </w:p>
-    <w:p>
-      <w:pPr>
+        <w:widowControl w:val="0"/>
+        <w:spacing w:line="324" w:lineRule="auto"/>
+        <w:ind w:left="18" w:right="-14" w:firstLine="5"/>
+        <w:rPr>
+          <w:lang w:val="es-CO"/>
+        </w:rPr>
+      </w:pPr>
+      <w:r>
+        <w:rPr>
+          <w:lang w:val="es-CO"/>
+        </w:rPr>
+        <w:t xml:space="preserve">├── </w:t>
+      </w:r>
+      <w:proofErr w:type="spellStart"/>
+      <w:r>
+        <w:rPr>
+          <w:lang w:val="es-CO"/>
+        </w:rPr>
+        <w:t>bd</w:t>
+      </w:r>
+      <w:proofErr w:type="spellEnd"/>
+      <w:r>
+        <w:rPr>
+          <w:lang w:val="es-CO"/>
+        </w:rPr>
+        <w:t>/                    # Scripts o archivos relacionados con la base de datos</w:t>
+      </w:r>
+    </w:p>
+    <w:p>
+      <w:pPr>
+        <w:widowControl w:val="0"/>
+        <w:spacing w:line="324" w:lineRule="auto"/>
+        <w:ind w:left="18" w:right="-14" w:firstLine="5"/>
+        <w:rPr>
+          <w:lang w:val="es-CO"/>
+        </w:rPr>
+      </w:pPr>
+      <w:r>
+        <w:rPr>
+          <w:lang w:val="es-CO"/>
+        </w:rPr>
+        <w:t>│</w:t>
+      </w:r>
+    </w:p>
+    <w:p>
+      <w:pPr>
+        <w:widowControl w:val="0"/>
+        <w:spacing w:line="324" w:lineRule="auto"/>
+        <w:ind w:left="18" w:right="-14" w:firstLine="5"/>
+        <w:rPr>
+          <w:lang w:val="es-CO"/>
+        </w:rPr>
+      </w:pPr>
+      <w:r>
+        <w:rPr>
+          <w:lang w:val="es-CO"/>
+        </w:rPr>
+        <w:t xml:space="preserve">├── </w:t>
+      </w:r>
+      <w:proofErr w:type="spellStart"/>
+      <w:r>
+        <w:rPr>
+          <w:lang w:val="es-CO"/>
+        </w:rPr>
+        <w:t>public</w:t>
+      </w:r>
+      <w:proofErr w:type="spellEnd"/>
+      <w:r>
+        <w:rPr>
+          <w:lang w:val="es-CO"/>
+        </w:rPr>
+        <w:t>/</w:t>
+      </w:r>
+    </w:p>
+    <w:p>
+      <w:pPr>
+        <w:widowControl w:val="0"/>
+        <w:spacing w:line="324" w:lineRule="auto"/>
+        <w:ind w:left="18" w:right="-14" w:firstLine="5"/>
         <w:rPr>
           <w:lang w:val="es-CO"/>
         </w:rPr>
@@ -5486,24 +5734,25 @@
         <w:t xml:space="preserve">│   ├── </w:t>
       </w:r>
       <w:proofErr w:type="spellStart"/>
-      <w:proofErr w:type="gramStart"/>
-      <w:r>
-        <w:rPr>
-          <w:lang w:val="es-CO"/>
-        </w:rPr>
-        <w:t>schema.prisma</w:t>
-      </w:r>
-      <w:proofErr w:type="spellEnd"/>
-      <w:proofErr w:type="gramEnd"/>
-      <w:r>
-        <w:rPr>
-          <w:lang w:val="es-CO"/>
-        </w:rPr>
-        <w:t xml:space="preserve">                   # Esquema de la base de datos</w:t>
-      </w:r>
-    </w:p>
-    <w:p>
-      <w:pPr>
+      <w:r>
+        <w:rPr>
+          <w:lang w:val="es-CO"/>
+        </w:rPr>
+        <w:t>css</w:t>
+      </w:r>
+      <w:proofErr w:type="spellEnd"/>
+      <w:r>
+        <w:rPr>
+          <w:lang w:val="es-CO"/>
+        </w:rPr>
+        <w:t>/               # Archivos de estilos de la aplicación</w:t>
+      </w:r>
+    </w:p>
+    <w:p>
+      <w:pPr>
+        <w:widowControl w:val="0"/>
+        <w:spacing w:line="324" w:lineRule="auto"/>
+        <w:ind w:left="18" w:right="-14" w:firstLine="5"/>
         <w:rPr>
           <w:lang w:val="es-CO"/>
         </w:rPr>
@@ -5519,18 +5768,125 @@
         <w:rPr>
           <w:lang w:val="es-CO"/>
         </w:rPr>
-        <w:t>seed.ts</w:t>
-      </w:r>
-      <w:proofErr w:type="spellEnd"/>
-      <w:r>
-        <w:rPr>
-          <w:lang w:val="es-CO"/>
-        </w:rPr>
-        <w:t xml:space="preserve">                         # Script para poblar datos iniciales</w:t>
-      </w:r>
-    </w:p>
-    <w:p>
-      <w:pPr>
+        <w:t>img</w:t>
+      </w:r>
+      <w:proofErr w:type="spellEnd"/>
+      <w:r>
+        <w:rPr>
+          <w:lang w:val="es-CO"/>
+        </w:rPr>
+        <w:t>/               # Recursos gráficos e imágenes del sistema</w:t>
+      </w:r>
+    </w:p>
+    <w:p>
+      <w:pPr>
+        <w:widowControl w:val="0"/>
+        <w:spacing w:line="324" w:lineRule="auto"/>
+        <w:ind w:left="18" w:right="-14" w:firstLine="5"/>
+        <w:rPr>
+          <w:lang w:val="es-CO"/>
+        </w:rPr>
+      </w:pPr>
+      <w:r>
+        <w:rPr>
+          <w:lang w:val="es-CO"/>
+        </w:rPr>
+        <w:t xml:space="preserve">│   ├── </w:t>
+      </w:r>
+      <w:proofErr w:type="spellStart"/>
+      <w:r>
+        <w:rPr>
+          <w:lang w:val="es-CO"/>
+        </w:rPr>
+        <w:t>js</w:t>
+      </w:r>
+      <w:proofErr w:type="spellEnd"/>
+      <w:r>
+        <w:rPr>
+          <w:lang w:val="es-CO"/>
+        </w:rPr>
+        <w:t>/                # Archivos JavaScript para interacción del cliente</w:t>
+      </w:r>
+    </w:p>
+    <w:p>
+      <w:pPr>
+        <w:widowControl w:val="0"/>
+        <w:spacing w:line="324" w:lineRule="auto"/>
+        <w:ind w:left="18" w:right="-14" w:firstLine="5"/>
+        <w:rPr>
+          <w:lang w:val="es-CO"/>
+        </w:rPr>
+      </w:pPr>
+      <w:r>
+        <w:rPr>
+          <w:lang w:val="es-CO"/>
+        </w:rPr>
+        <w:t>│   ├── .</w:t>
+      </w:r>
+      <w:proofErr w:type="spellStart"/>
+      <w:r>
+        <w:rPr>
+          <w:lang w:val="es-CO"/>
+        </w:rPr>
+        <w:t>htaccess</w:t>
+      </w:r>
+      <w:proofErr w:type="spellEnd"/>
+      <w:r>
+        <w:rPr>
+          <w:lang w:val="es-CO"/>
+        </w:rPr>
+        <w:t xml:space="preserve">          # Configuración de rutas y redirecciones</w:t>
+      </w:r>
+    </w:p>
+    <w:p>
+      <w:pPr>
+        <w:widowControl w:val="0"/>
+        <w:spacing w:line="324" w:lineRule="auto"/>
+        <w:ind w:left="18" w:right="-14" w:firstLine="5"/>
+        <w:rPr>
+          <w:lang w:val="es-CO"/>
+        </w:rPr>
+      </w:pPr>
+      <w:r>
+        <w:rPr>
+          <w:lang w:val="es-CO"/>
+        </w:rPr>
+        <w:t xml:space="preserve">│   ├── </w:t>
+      </w:r>
+      <w:proofErr w:type="spellStart"/>
+      <w:r>
+        <w:rPr>
+          <w:lang w:val="es-CO"/>
+        </w:rPr>
+        <w:t>index.php</w:t>
+      </w:r>
+      <w:proofErr w:type="spellEnd"/>
+      <w:r>
+        <w:rPr>
+          <w:lang w:val="es-CO"/>
+        </w:rPr>
+        <w:t xml:space="preserve">          # Punto de entrada principal de la aplicación (Front </w:t>
+      </w:r>
+      <w:proofErr w:type="spellStart"/>
+      <w:r>
+        <w:rPr>
+          <w:lang w:val="es-CO"/>
+        </w:rPr>
+        <w:t>Controller</w:t>
+      </w:r>
+      <w:proofErr w:type="spellEnd"/>
+      <w:r>
+        <w:rPr>
+          <w:lang w:val="es-CO"/>
+        </w:rPr>
+        <w:t>)</w:t>
+      </w:r>
+    </w:p>
+    <w:p>
+      <w:pPr>
+        <w:widowControl w:val="0"/>
+        <w:spacing w:line="324" w:lineRule="auto"/>
+        <w:ind w:left="18" w:right="-14" w:firstLine="5"/>
         <w:rPr>
           <w:lang w:val="es-CO"/>
         </w:rPr>
@@ -5546,767 +5902,143 @@
         <w:rPr>
           <w:lang w:val="es-CO"/>
         </w:rPr>
-        <w:t>migrations</w:t>
-      </w:r>
-      <w:proofErr w:type="spellEnd"/>
-      <w:r>
-        <w:rPr>
-          <w:lang w:val="es-CO"/>
-        </w:rPr>
-        <w:t>/                     # Migraciones de la base de datos</w:t>
-      </w:r>
-    </w:p>
-    <w:p>
-      <w:r>
+        <w:t>test_drivers.php</w:t>
+      </w:r>
+      <w:proofErr w:type="spellEnd"/>
+      <w:r>
+        <w:rPr>
+          <w:lang w:val="es-CO"/>
+        </w:rPr>
+        <w:t xml:space="preserve">   # Script de prueba para verificar drivers y conexión a la base de datos</w:t>
+      </w:r>
+    </w:p>
+    <w:p>
+      <w:pPr>
+        <w:widowControl w:val="0"/>
+        <w:spacing w:line="324" w:lineRule="auto"/>
+        <w:ind w:left="18" w:right="-14" w:firstLine="5"/>
+        <w:rPr>
+          <w:lang w:val="es-CO"/>
+        </w:rPr>
+      </w:pPr>
+      <w:r>
+        <w:rPr>
+          <w:lang w:val="es-CO"/>
+        </w:rPr>
+        <w:t>│</w:t>
+      </w:r>
+    </w:p>
+    <w:p>
+      <w:pPr>
+        <w:widowControl w:val="0"/>
+        <w:spacing w:line="324" w:lineRule="auto"/>
+        <w:ind w:left="18" w:right="-14" w:firstLine="5"/>
+        <w:rPr>
+          <w:lang w:val="es-CO"/>
+        </w:rPr>
+      </w:pPr>
+      <w:r>
+        <w:rPr>
+          <w:lang w:val="es-CO"/>
+        </w:rPr>
         <w:t xml:space="preserve">├── </w:t>
       </w:r>
       <w:proofErr w:type="spellStart"/>
       <w:r>
-        <w:t>src</w:t>
-      </w:r>
-      <w:proofErr w:type="spellEnd"/>
-      <w:r>
-        <w:t>/</w:t>
-      </w:r>
-    </w:p>
-    <w:p>
-      <w:r>
-        <w:t>│   ├── app/                            # App Router de Next.js</w:t>
-      </w:r>
-    </w:p>
-    <w:p>
-      <w:pPr>
-        <w:rPr>
-          <w:lang w:val="es-CO"/>
-        </w:rPr>
-      </w:pPr>
-      <w:r>
-        <w:rPr>
-          <w:lang w:val="es-CO"/>
-        </w:rPr>
-        <w:t xml:space="preserve">│   │   ├── </w:t>
-      </w:r>
-      <w:proofErr w:type="spellStart"/>
-      <w:r>
-        <w:rPr>
-          <w:lang w:val="es-CO"/>
-        </w:rPr>
-        <w:t>layout.tsx</w:t>
-      </w:r>
-      <w:proofErr w:type="spellEnd"/>
-      <w:r>
-        <w:rPr>
-          <w:lang w:val="es-CO"/>
-        </w:rPr>
-        <w:t xml:space="preserve">                  # </w:t>
-      </w:r>
-      <w:proofErr w:type="spellStart"/>
-      <w:r>
-        <w:rPr>
-          <w:lang w:val="es-CO"/>
-        </w:rPr>
-        <w:t>Layout</w:t>
-      </w:r>
-      <w:proofErr w:type="spellEnd"/>
-      <w:r>
-        <w:rPr>
-          <w:lang w:val="es-CO"/>
-        </w:rPr>
-        <w:t xml:space="preserve"> principal</w:t>
-      </w:r>
-    </w:p>
-    <w:p>
-      <w:pPr>
-        <w:rPr>
-          <w:lang w:val="es-CO"/>
-        </w:rPr>
-      </w:pPr>
-      <w:r>
-        <w:rPr>
-          <w:lang w:val="es-CO"/>
-        </w:rPr>
-        <w:t xml:space="preserve">│   │   ├── </w:t>
-      </w:r>
-      <w:proofErr w:type="spellStart"/>
-      <w:r>
-        <w:rPr>
-          <w:lang w:val="es-CO"/>
-        </w:rPr>
-        <w:t>page.tsx</w:t>
-      </w:r>
-      <w:proofErr w:type="spellEnd"/>
-      <w:r>
-        <w:rPr>
-          <w:lang w:val="es-CO"/>
-        </w:rPr>
-        <w:t xml:space="preserve">                    # Página de inicio</w:t>
-      </w:r>
-    </w:p>
-    <w:p>
-      <w:pPr>
-        <w:rPr>
-          <w:lang w:val="es-CO"/>
-        </w:rPr>
-      </w:pPr>
-      <w:r>
-        <w:rPr>
-          <w:lang w:val="es-CO"/>
-        </w:rPr>
-        <w:t>│   │   ├── globals.css                 # Estilos globales</w:t>
-      </w:r>
-    </w:p>
-    <w:p>
-      <w:pPr>
-        <w:rPr>
-          <w:lang w:val="es-CO"/>
-        </w:rPr>
-      </w:pPr>
-      <w:r>
-        <w:rPr>
-          <w:lang w:val="es-CO"/>
-        </w:rPr>
-        <w:t>│   │   │</w:t>
-      </w:r>
-    </w:p>
-    <w:p>
-      <w:pPr>
-        <w:rPr>
-          <w:lang w:val="es-CO"/>
-        </w:rPr>
-      </w:pPr>
-      <w:r>
-        <w:rPr>
-          <w:lang w:val="es-CO"/>
-        </w:rPr>
-        <w:t>│   │   ├── (home)/                     # Páginas públicas principales</w:t>
-      </w:r>
-    </w:p>
-    <w:p>
-      <w:pPr>
-        <w:rPr>
-          <w:lang w:val="es-CO"/>
-        </w:rPr>
-      </w:pPr>
-      <w:r>
-        <w:rPr>
-          <w:lang w:val="es-CO"/>
-        </w:rPr>
-        <w:t xml:space="preserve">│   │   │   ├── </w:t>
-      </w:r>
-      <w:proofErr w:type="spellStart"/>
-      <w:r>
-        <w:rPr>
-          <w:lang w:val="es-CO"/>
-        </w:rPr>
-        <w:t>page.tsx</w:t>
-      </w:r>
-      <w:proofErr w:type="spellEnd"/>
-      <w:r>
-        <w:rPr>
-          <w:lang w:val="es-CO"/>
-        </w:rPr>
-        <w:t xml:space="preserve">                # Página de inicio</w:t>
-      </w:r>
-    </w:p>
-    <w:p>
-      <w:pPr>
-        <w:rPr>
-          <w:lang w:val="es-CO"/>
-        </w:rPr>
-      </w:pPr>
-      <w:r>
-        <w:rPr>
-          <w:lang w:val="es-CO"/>
-        </w:rPr>
-        <w:t xml:space="preserve">│   │   │   ├── </w:t>
-      </w:r>
-      <w:proofErr w:type="spellStart"/>
-      <w:r>
-        <w:rPr>
-          <w:lang w:val="es-CO"/>
-        </w:rPr>
-        <w:t>about</w:t>
-      </w:r>
-      <w:proofErr w:type="spellEnd"/>
-      <w:r>
-        <w:rPr>
-          <w:lang w:val="es-CO"/>
-        </w:rPr>
-        <w:t>/</w:t>
-      </w:r>
-    </w:p>
-    <w:p>
-      <w:pPr>
-        <w:rPr>
-          <w:lang w:val="es-CO"/>
-        </w:rPr>
-      </w:pPr>
-      <w:r>
-        <w:rPr>
-          <w:lang w:val="es-CO"/>
-        </w:rPr>
-        <w:t xml:space="preserve">│   │   │   │   └── </w:t>
-      </w:r>
-      <w:proofErr w:type="spellStart"/>
-      <w:r>
-        <w:rPr>
-          <w:lang w:val="es-CO"/>
-        </w:rPr>
-        <w:t>page.tsx</w:t>
-      </w:r>
-      <w:proofErr w:type="spellEnd"/>
-    </w:p>
-    <w:p>
-      <w:pPr>
-        <w:rPr>
-          <w:lang w:val="es-CO"/>
-        </w:rPr>
-      </w:pPr>
-      <w:r>
-        <w:rPr>
-          <w:lang w:val="es-CO"/>
-        </w:rPr>
-        <w:t xml:space="preserve">│   │   │   └── </w:t>
-      </w:r>
-      <w:proofErr w:type="spellStart"/>
-      <w:r>
-        <w:rPr>
-          <w:lang w:val="es-CO"/>
-        </w:rPr>
-        <w:t>contact</w:t>
-      </w:r>
-      <w:proofErr w:type="spellEnd"/>
-      <w:r>
-        <w:rPr>
-          <w:lang w:val="es-CO"/>
-        </w:rPr>
-        <w:t>/</w:t>
-      </w:r>
-    </w:p>
-    <w:p>
-      <w:pPr>
-        <w:rPr>
-          <w:lang w:val="es-CO"/>
-        </w:rPr>
-      </w:pPr>
-      <w:r>
-        <w:rPr>
-          <w:lang w:val="es-CO"/>
-        </w:rPr>
-        <w:t xml:space="preserve">│   │   │       └── </w:t>
-      </w:r>
-      <w:proofErr w:type="spellStart"/>
-      <w:r>
-        <w:rPr>
-          <w:lang w:val="es-CO"/>
-        </w:rPr>
-        <w:t>page.tsx</w:t>
-      </w:r>
-      <w:proofErr w:type="spellEnd"/>
-    </w:p>
-    <w:p>
-      <w:pPr>
-        <w:rPr>
-          <w:lang w:val="es-CO"/>
-        </w:rPr>
-      </w:pPr>
-      <w:r>
-        <w:rPr>
-          <w:lang w:val="es-CO"/>
-        </w:rPr>
-        <w:t>│   │   │</w:t>
-      </w:r>
-    </w:p>
-    <w:p>
-      <w:pPr>
-        <w:rPr>
-          <w:lang w:val="es-CO"/>
-        </w:rPr>
-      </w:pPr>
-      <w:r>
-        <w:rPr>
-          <w:lang w:val="es-CO"/>
-        </w:rPr>
-        <w:t xml:space="preserve">│   │   ├── </w:t>
-      </w:r>
-      <w:proofErr w:type="spellStart"/>
-      <w:r>
-        <w:rPr>
-          <w:lang w:val="es-CO"/>
-        </w:rPr>
-        <w:t>products</w:t>
-      </w:r>
-      <w:proofErr w:type="spellEnd"/>
-      <w:r>
-        <w:rPr>
-          <w:lang w:val="es-CO"/>
-        </w:rPr>
-        <w:t>/                   # Catálogo de productos</w:t>
-      </w:r>
-    </w:p>
-    <w:p>
-      <w:pPr>
-        <w:rPr>
-          <w:lang w:val="es-CO"/>
-        </w:rPr>
-      </w:pPr>
-      <w:r>
-        <w:rPr>
-          <w:lang w:val="es-CO"/>
-        </w:rPr>
-        <w:t xml:space="preserve">│   │   │   ├── </w:t>
-      </w:r>
-      <w:proofErr w:type="spellStart"/>
-      <w:r>
-        <w:rPr>
-          <w:lang w:val="es-CO"/>
-        </w:rPr>
-        <w:t>page.tsx</w:t>
-      </w:r>
-      <w:proofErr w:type="spellEnd"/>
-    </w:p>
-    <w:p>
-      <w:pPr>
-        <w:rPr>
-          <w:lang w:val="es-CO"/>
-        </w:rPr>
-      </w:pPr>
-      <w:r>
-        <w:rPr>
-          <w:lang w:val="es-CO"/>
-        </w:rPr>
-        <w:t>│   │   │   ├── [id]/</w:t>
-      </w:r>
-      <w:proofErr w:type="spellStart"/>
-      <w:r>
-        <w:rPr>
-          <w:lang w:val="es-CO"/>
-        </w:rPr>
-        <w:t>page.tsx</w:t>
-      </w:r>
-      <w:proofErr w:type="spellEnd"/>
-    </w:p>
-    <w:p>
-      <w:pPr>
-        <w:rPr>
-          <w:lang w:val="es-CO"/>
-        </w:rPr>
-      </w:pPr>
-      <w:r>
-        <w:rPr>
-          <w:lang w:val="es-CO"/>
-        </w:rPr>
-        <w:t xml:space="preserve">│   │   │   └── </w:t>
-      </w:r>
-      <w:proofErr w:type="spellStart"/>
-      <w:r>
-        <w:rPr>
-          <w:lang w:val="es-CO"/>
-        </w:rPr>
-        <w:t>components</w:t>
-      </w:r>
-      <w:proofErr w:type="spellEnd"/>
-      <w:r>
-        <w:rPr>
-          <w:lang w:val="es-CO"/>
-        </w:rPr>
-        <w:t>/</w:t>
-      </w:r>
-    </w:p>
-    <w:p>
-      <w:pPr>
-        <w:rPr>
-          <w:lang w:val="es-CO"/>
-        </w:rPr>
-      </w:pPr>
-      <w:r>
-        <w:rPr>
-          <w:lang w:val="es-CO"/>
-        </w:rPr>
-        <w:t xml:space="preserve">│   │   │       ├── </w:t>
-      </w:r>
-      <w:proofErr w:type="spellStart"/>
-      <w:r>
-        <w:rPr>
-          <w:lang w:val="es-CO"/>
-        </w:rPr>
-        <w:t>ProductGrid.tsx</w:t>
-      </w:r>
-      <w:proofErr w:type="spellEnd"/>
-    </w:p>
-    <w:p>
-      <w:pPr>
-        <w:rPr>
-          <w:lang w:val="es-CO"/>
-        </w:rPr>
-      </w:pPr>
-      <w:r>
-        <w:rPr>
-          <w:lang w:val="es-CO"/>
-        </w:rPr>
-        <w:t xml:space="preserve">│   │   │       └── </w:t>
-      </w:r>
-      <w:proofErr w:type="spellStart"/>
-      <w:r>
-        <w:rPr>
-          <w:lang w:val="es-CO"/>
-        </w:rPr>
-        <w:t>ProductCard.tsx</w:t>
-      </w:r>
-      <w:proofErr w:type="spellEnd"/>
-    </w:p>
-    <w:p>
-      <w:pPr>
-        <w:rPr>
-          <w:lang w:val="es-CO"/>
-        </w:rPr>
-      </w:pPr>
-      <w:r>
-        <w:rPr>
-          <w:lang w:val="es-CO"/>
-        </w:rPr>
-        <w:t>│   │   │</w:t>
-      </w:r>
-    </w:p>
-    <w:p>
-      <w:pPr>
-        <w:rPr>
-          <w:lang w:val="es-CO"/>
-        </w:rPr>
-      </w:pPr>
-      <w:r>
-        <w:rPr>
-          <w:lang w:val="es-CO"/>
-        </w:rPr>
-        <w:t>│   │   └── user/                       # Panel de usuario</w:t>
-      </w:r>
-    </w:p>
-    <w:p>
-      <w:pPr>
-        <w:rPr>
-          <w:lang w:val="es-CO"/>
-        </w:rPr>
-      </w:pPr>
-      <w:r>
-        <w:rPr>
-          <w:lang w:val="es-CO"/>
-        </w:rPr>
-        <w:t xml:space="preserve">│   │       ├── </w:t>
-      </w:r>
-      <w:proofErr w:type="spellStart"/>
-      <w:r>
-        <w:rPr>
-          <w:lang w:val="es-CO"/>
-        </w:rPr>
-        <w:t>page.tsx</w:t>
-      </w:r>
-      <w:proofErr w:type="spellEnd"/>
-      <w:r>
-        <w:rPr>
-          <w:lang w:val="es-CO"/>
-        </w:rPr>
-        <w:t xml:space="preserve">                # </w:t>
-      </w:r>
-      <w:proofErr w:type="spellStart"/>
-      <w:r>
-        <w:rPr>
-          <w:lang w:val="es-CO"/>
-        </w:rPr>
-        <w:t>Dashboard</w:t>
-      </w:r>
-      <w:proofErr w:type="spellEnd"/>
-      <w:r>
-        <w:rPr>
-          <w:lang w:val="es-CO"/>
-        </w:rPr>
-        <w:t xml:space="preserve"> del usuario</w:t>
-      </w:r>
-    </w:p>
-    <w:p>
-      <w:pPr>
-        <w:rPr>
-          <w:lang w:val="es-CO"/>
-        </w:rPr>
-      </w:pPr>
-      <w:r>
-        <w:rPr>
-          <w:lang w:val="es-CO"/>
-        </w:rPr>
-        <w:t xml:space="preserve">│   │       ├── </w:t>
-      </w:r>
-      <w:proofErr w:type="spellStart"/>
-      <w:r>
-        <w:rPr>
-          <w:lang w:val="es-CO"/>
-        </w:rPr>
-        <w:t>profile</w:t>
-      </w:r>
-      <w:proofErr w:type="spellEnd"/>
-      <w:r>
-        <w:rPr>
-          <w:lang w:val="es-CO"/>
-        </w:rPr>
-        <w:t>/</w:t>
-      </w:r>
-      <w:proofErr w:type="spellStart"/>
-      <w:r>
-        <w:rPr>
-          <w:lang w:val="es-CO"/>
-        </w:rPr>
-        <w:t>page.tsx</w:t>
-      </w:r>
-      <w:proofErr w:type="spellEnd"/>
-    </w:p>
-    <w:p>
-      <w:pPr>
-        <w:rPr>
-          <w:lang w:val="es-CO"/>
-        </w:rPr>
-      </w:pPr>
-      <w:r>
-        <w:rPr>
-          <w:lang w:val="es-CO"/>
-        </w:rPr>
-        <w:t xml:space="preserve">│   │       ├── </w:t>
-      </w:r>
-      <w:proofErr w:type="spellStart"/>
-      <w:r>
-        <w:rPr>
-          <w:lang w:val="es-CO"/>
-        </w:rPr>
-        <w:t>orders</w:t>
-      </w:r>
-      <w:proofErr w:type="spellEnd"/>
-      <w:r>
-        <w:rPr>
-          <w:lang w:val="es-CO"/>
-        </w:rPr>
-        <w:t>/</w:t>
-      </w:r>
-      <w:proofErr w:type="spellStart"/>
-      <w:r>
-        <w:rPr>
-          <w:lang w:val="es-CO"/>
-        </w:rPr>
-        <w:t>page.tsx</w:t>
-      </w:r>
-      <w:proofErr w:type="spellEnd"/>
-    </w:p>
-    <w:p>
-      <w:pPr>
-        <w:rPr>
-          <w:lang w:val="es-CO"/>
-        </w:rPr>
-      </w:pPr>
-      <w:r>
-        <w:rPr>
-          <w:lang w:val="es-CO"/>
-        </w:rPr>
-        <w:t xml:space="preserve">│   │       ├── </w:t>
-      </w:r>
-      <w:proofErr w:type="spellStart"/>
-      <w:r>
-        <w:rPr>
-          <w:lang w:val="es-CO"/>
-        </w:rPr>
-        <w:t>courses</w:t>
-      </w:r>
-      <w:proofErr w:type="spellEnd"/>
-      <w:r>
-        <w:rPr>
-          <w:lang w:val="es-CO"/>
-        </w:rPr>
-        <w:t>/</w:t>
-      </w:r>
-      <w:proofErr w:type="spellStart"/>
-      <w:r>
-        <w:rPr>
-          <w:lang w:val="es-CO"/>
-        </w:rPr>
-        <w:t>page.tsx</w:t>
-      </w:r>
-      <w:proofErr w:type="spellEnd"/>
-    </w:p>
-    <w:p>
-      <w:pPr>
-        <w:rPr>
-          <w:lang w:val="es-CO"/>
-        </w:rPr>
-      </w:pPr>
-      <w:r>
-        <w:rPr>
-          <w:lang w:val="es-CO"/>
-        </w:rPr>
-        <w:t xml:space="preserve">│   │       └── </w:t>
-      </w:r>
-      <w:proofErr w:type="spellStart"/>
-      <w:r>
-        <w:rPr>
-          <w:lang w:val="es-CO"/>
-        </w:rPr>
-        <w:t>components</w:t>
-      </w:r>
-      <w:proofErr w:type="spellEnd"/>
-      <w:r>
-        <w:rPr>
-          <w:lang w:val="es-CO"/>
-        </w:rPr>
-        <w:t>/</w:t>
-      </w:r>
-    </w:p>
-    <w:p>
-      <w:pPr>
-        <w:rPr>
-          <w:lang w:val="es-CO"/>
-        </w:rPr>
-      </w:pPr>
-      <w:r>
-        <w:rPr>
-          <w:lang w:val="es-CO"/>
-        </w:rPr>
-        <w:lastRenderedPageBreak/>
-        <w:t xml:space="preserve">│   │           └── </w:t>
-      </w:r>
-      <w:proofErr w:type="spellStart"/>
-      <w:r>
-        <w:rPr>
-          <w:lang w:val="es-CO"/>
-        </w:rPr>
-        <w:t>UserSidebar.tsx</w:t>
-      </w:r>
-      <w:proofErr w:type="spellEnd"/>
-      <w:r>
-        <w:rPr>
-          <w:lang w:val="es-CO"/>
-        </w:rPr>
-        <w:t xml:space="preserve">└── </w:t>
-      </w:r>
-      <w:proofErr w:type="spellStart"/>
-      <w:r>
-        <w:rPr>
-          <w:lang w:val="es-CO"/>
-        </w:rPr>
-        <w:t>page.tsx</w:t>
-      </w:r>
-      <w:proofErr w:type="spellEnd"/>
-    </w:p>
-    <w:p>
-      <w:pPr>
-        <w:rPr>
-          <w:lang w:val="es-CO"/>
-        </w:rPr>
-      </w:pPr>
-      <w:r>
-        <w:rPr>
-          <w:lang w:val="es-CO"/>
-        </w:rPr>
-        <w:t xml:space="preserve">│   │   │   └── </w:t>
-      </w:r>
-      <w:proofErr w:type="spellStart"/>
-      <w:r>
-        <w:rPr>
-          <w:lang w:val="es-CO"/>
-        </w:rPr>
-        <w:t>components</w:t>
-      </w:r>
-      <w:proofErr w:type="spellEnd"/>
-      <w:r>
-        <w:rPr>
-          <w:lang w:val="es-CO"/>
-        </w:rPr>
-        <w:t>/</w:t>
-      </w:r>
-    </w:p>
-    <w:p>
-      <w:pPr>
-        <w:rPr>
-          <w:lang w:val="es-CO"/>
-        </w:rPr>
-      </w:pPr>
-      <w:r>
-        <w:rPr>
-          <w:lang w:val="es-CO"/>
-        </w:rPr>
-        <w:t xml:space="preserve">│   │   │       ├── </w:t>
-      </w:r>
-      <w:proofErr w:type="spellStart"/>
-      <w:r>
-        <w:rPr>
-          <w:lang w:val="es-CO"/>
-        </w:rPr>
-        <w:t>UserSidebar.tsx</w:t>
-      </w:r>
-      <w:proofErr w:type="spellEnd"/>
-    </w:p>
-    <w:p>
-      <w:pPr>
-        <w:rPr>
-          <w:lang w:val="es-CO"/>
-        </w:rPr>
-      </w:pPr>
-      <w:r>
-        <w:rPr>
-          <w:lang w:val="es-CO"/>
-        </w:rPr>
-        <w:t xml:space="preserve">│   │   │       ├── </w:t>
-      </w:r>
-      <w:proofErr w:type="spellStart"/>
-      <w:r>
-        <w:rPr>
-          <w:lang w:val="es-CO"/>
-        </w:rPr>
-        <w:t>OrderCard.tsx</w:t>
-      </w:r>
-      <w:proofErr w:type="spellEnd"/>
-    </w:p>
-    <w:p>
-      <w:pPr>
-        <w:rPr>
-          <w:lang w:val="es-CO"/>
-        </w:rPr>
-      </w:pPr>
-      <w:r>
-        <w:rPr>
-          <w:lang w:val="es-CO"/>
-        </w:rPr>
-        <w:t xml:space="preserve">│   │   │       ├── </w:t>
-      </w:r>
-      <w:proofErr w:type="spellStart"/>
-      <w:r>
-        <w:rPr>
-          <w:lang w:val="es-CO"/>
-        </w:rPr>
-        <w:t>CourseProgress.tsx</w:t>
-      </w:r>
-      <w:proofErr w:type="spellEnd"/>
-    </w:p>
-    <w:p>
-      <w:pPr>
-        <w:rPr>
-          <w:lang w:val="es-CO"/>
-        </w:rPr>
-      </w:pPr>
-      <w:r>
-        <w:rPr>
-          <w:lang w:val="es-CO"/>
-        </w:rPr>
-        <w:t xml:space="preserve">│   │   │       └── </w:t>
-      </w:r>
-      <w:proofErr w:type="spellStart"/>
-      <w:r>
-        <w:rPr>
-          <w:lang w:val="es-CO"/>
-        </w:rPr>
-        <w:t>AddressCard.tsx</w:t>
-      </w:r>
-      <w:proofErr w:type="spellEnd"/>
-    </w:p>
-    <w:p>
-      <w:pPr>
-        <w:rPr>
-          <w:lang w:val="es-CO"/>
-        </w:rPr>
-      </w:pPr>
+        <w:rPr>
+          <w:lang w:val="es-CO"/>
+        </w:rPr>
+        <w:t>vendor</w:t>
+      </w:r>
+      <w:proofErr w:type="spellEnd"/>
+      <w:r>
+        <w:rPr>
+          <w:lang w:val="es-CO"/>
+        </w:rPr>
+        <w:t xml:space="preserve">/                # Dependencias externas gestionadas por </w:t>
+      </w:r>
+      <w:proofErr w:type="spellStart"/>
+      <w:r>
+        <w:rPr>
+          <w:lang w:val="es-CO"/>
+        </w:rPr>
+        <w:t>Composer</w:t>
+      </w:r>
+      <w:proofErr w:type="spellEnd"/>
+    </w:p>
+    <w:p>
+      <w:pPr>
+        <w:widowControl w:val="0"/>
+        <w:spacing w:line="324" w:lineRule="auto"/>
+        <w:ind w:left="18" w:right="-14" w:firstLine="5"/>
+        <w:rPr>
+          <w:lang w:val="es-CO"/>
+        </w:rPr>
+      </w:pPr>
+      <w:r>
+        <w:rPr>
+          <w:lang w:val="es-CO"/>
+        </w:rPr>
+        <w:t>│</w:t>
+      </w:r>
+    </w:p>
+    <w:p>
+      <w:pPr>
+        <w:widowControl w:val="0"/>
+        <w:spacing w:line="324" w:lineRule="auto"/>
+        <w:ind w:left="18" w:right="-14" w:firstLine="5"/>
+        <w:rPr>
+          <w:lang w:val="es-CO"/>
+        </w:rPr>
+      </w:pPr>
+      <w:r>
+        <w:rPr>
+          <w:lang w:val="es-CO"/>
+        </w:rPr>
+        <w:t xml:space="preserve">├── </w:t>
+      </w:r>
+      <w:proofErr w:type="spellStart"/>
+      <w:r>
+        <w:rPr>
+          <w:lang w:val="es-CO"/>
+        </w:rPr>
+        <w:t>Dockerfile</w:t>
+      </w:r>
+      <w:proofErr w:type="spellEnd"/>
+      <w:r>
+        <w:rPr>
+          <w:lang w:val="es-CO"/>
+        </w:rPr>
+        <w:t xml:space="preserve">            </w:t>
+      </w:r>
+      <w:r>
+        <w:rPr>
+          <w:sz w:val="20"/>
+          <w:szCs w:val="20"/>
+          <w:lang w:val="es-CO"/>
+        </w:rPr>
+        <w:t xml:space="preserve"> # Configuración para despliegue del sistema mediante contenedores </w:t>
+      </w:r>
+      <w:proofErr w:type="spellStart"/>
+      <w:r>
+        <w:rPr>
+          <w:sz w:val="20"/>
+          <w:szCs w:val="20"/>
+          <w:lang w:val="es-CO"/>
+        </w:rPr>
+        <w:t>Docker</w:t>
+      </w:r>
+      <w:proofErr w:type="spellEnd"/>
+    </w:p>
+    <w:p>
+      <w:pPr>
+        <w:widowControl w:val="0"/>
+        <w:spacing w:line="324" w:lineRule="auto"/>
+        <w:ind w:left="18" w:right="-14" w:firstLine="5"/>
+      </w:pPr>
+      <w:r>
+        <w:t>│</w:t>
+      </w:r>
     </w:p>
     <w:p>
       <w:pPr>
@@ -6321,6 +6053,13 @@
           <w:lang w:val="es-CO"/>
         </w:rPr>
       </w:pPr>
+      <w:r>
+        <w:rPr>
+          <w:lang w:val="es-CO"/>
+        </w:rPr>
+        <w:lastRenderedPageBreak/>
+        <w:t>└── README.md              # Documentación general del proyecto</w:t>
+      </w:r>
     </w:p>
     <w:p>
       <w:pPr>
@@ -6335,19 +6074,6 @@
           <w:lang w:val="es-CO"/>
         </w:rPr>
       </w:pPr>
-    </w:p>
-    <w:p>
-      <w:pPr>
-        <w:rPr>
-          <w:lang w:val="es-CO"/>
-        </w:rPr>
-      </w:pPr>
-      <w:r>
-        <w:rPr>
-          <w:lang w:val="es-CO"/>
-        </w:rPr>
-        <w:t>Esta estructura facilita la colaboración entre equipos, la escalabilidad del proyecto y la incorporación de nuevas funcionalidades de manera organizada.</w:t>
-      </w:r>
     </w:p>
     <w:p>
       <w:pPr>
@@ -6362,12 +6088,58 @@
         <w:spacing w:line="324" w:lineRule="auto"/>
         <w:ind w:left="18" w:right="-14"/>
         <w:rPr>
+          <w:lang w:val="es-CO"/>
+        </w:rPr>
+      </w:pPr>
+      <w:r>
+        <w:rPr>
+          <w:lang w:val="es-CO"/>
+        </w:rPr>
+        <w:t>Esta estructura permite mantener una clara separación entre la lógica del negocio, la presentación y el control del flujo de la aplicación, siguiendo las buenas prácticas del desarrollo de software basado en arquitectura MVC.</w:t>
+      </w:r>
+    </w:p>
+    <w:p>
+      <w:pPr>
+        <w:widowControl w:val="0"/>
+        <w:pBdr>
+          <w:top w:val="nil"/>
+          <w:left w:val="nil"/>
+          <w:bottom w:val="nil"/>
+          <w:right w:val="nil"/>
+          <w:between w:val="nil"/>
+        </w:pBdr>
+        <w:spacing w:line="324" w:lineRule="auto"/>
+        <w:ind w:left="18" w:right="-14"/>
+        <w:rPr>
+          <w:lang w:val="es-CO"/>
+        </w:rPr>
+      </w:pPr>
+    </w:p>
+    <w:p>
+      <w:pPr>
+        <w:widowControl w:val="0"/>
+        <w:pBdr>
+          <w:top w:val="nil"/>
+          <w:left w:val="nil"/>
+          <w:bottom w:val="nil"/>
+          <w:right w:val="nil"/>
+          <w:between w:val="nil"/>
+        </w:pBdr>
+        <w:spacing w:line="324" w:lineRule="auto"/>
+        <w:ind w:left="18" w:right="-14"/>
+        <w:rPr>
           <w:color w:val="333333"/>
           <w:sz w:val="25"/>
           <w:szCs w:val="25"/>
           <w:lang w:val="es-CO"/>
         </w:rPr>
       </w:pPr>
+      <w:r>
+        <w:rPr>
+          <w:lang w:val="es-CO"/>
+        </w:rPr>
+        <w:t>Además, facilita el trabajo colaborativo entre los miembros del equipo de desarrollo, permitiendo que cada componente pueda evolucionar de manera independiente y que nuevas funcionalidades puedan integrarse al sistema de forma organizada.</w:t>
+      </w:r>
     </w:p>
     <w:p>
       <w:pPr>
@@ -6379,14 +6151,16 @@
           <w:lang w:val="es-CO"/>
         </w:rPr>
       </w:pPr>
-      <w:bookmarkStart w:id="26" w:name="_bhfx82l7fu5x" w:colFirst="0" w:colLast="0"/>
+      <w:bookmarkStart w:id="25" w:name="_bhfx82l7fu5x" w:colFirst="0" w:colLast="0"/>
+      <w:bookmarkEnd w:id="25"/>
+      <w:r>
+        <w:rPr>
+          <w:lang w:val="es-CO"/>
+        </w:rPr>
+        <w:t xml:space="preserve">7.  Dependencias Clave </w:t>
+      </w:r>
+      <w:bookmarkStart w:id="26" w:name="_GoBack"/>
       <w:bookmarkEnd w:id="26"/>
-      <w:r>
-        <w:rPr>
-          <w:lang w:val="es-CO"/>
-        </w:rPr>
-        <w:t xml:space="preserve">7.  Dependencias Clave </w:t>
-      </w:r>
     </w:p>
     <w:p>
       <w:pPr>

</xml_diff>

<commit_message>
Sección # 9: Requerimientos del sistema finalizado del manual técnico
</commit_message>
<xml_diff>
--- a/Manual Técnico Sena Contigo.docx
+++ b/Manual Técnico Sena Contigo.docx
@@ -7497,15 +7497,7 @@
         <w:rPr>
           <w:lang w:val="es-CO"/>
         </w:rPr>
-        <w:t xml:space="preserve">El proyecto SENA Contigo está desarrollado utilizando el patrón de arquitectura MVC (Modelo – Vista – Controlador). Este patrón permite separar las responsabilidades del sistema en tres componentes principales, facilitando la organización del código, el </w:t>
-      </w:r>
-      <w:bookmarkStart w:id="27" w:name="_GoBack"/>
-      <w:bookmarkEnd w:id="27"/>
-      <w:r>
-        <w:rPr>
-          <w:lang w:val="es-CO"/>
-        </w:rPr>
-        <w:t>mantenimiento del software y la escalabilidad del proyecto.</w:t>
+        <w:t>El proyecto SENA Contigo está desarrollado utilizando el patrón de arquitectura MVC (Modelo – Vista – Controlador). Este patrón permite separar las responsabilidades del sistema en tres componentes principales, facilitando la organización del código, el mantenimiento del software y la escalabilidad del proyecto.</w:t>
       </w:r>
     </w:p>
     <w:p>
@@ -7546,8 +7538,8 @@
           <w:lang w:val="es-CO"/>
         </w:rPr>
       </w:pPr>
-      <w:bookmarkStart w:id="28" w:name="_e6bt7efzq33p" w:colFirst="0" w:colLast="0"/>
-      <w:bookmarkEnd w:id="28"/>
+      <w:bookmarkStart w:id="27" w:name="_e6bt7efzq33p" w:colFirst="0" w:colLast="0"/>
+      <w:bookmarkEnd w:id="27"/>
       <w:r>
         <w:rPr>
           <w:b/>
@@ -7583,8 +7575,8 @@
         </w:rPr>
         <w:t>)</w:t>
       </w:r>
-      <w:bookmarkStart w:id="29" w:name="_3e6agw1ig94n" w:colFirst="0" w:colLast="0"/>
-      <w:bookmarkEnd w:id="29"/>
+      <w:bookmarkStart w:id="28" w:name="_3e6agw1ig94n" w:colFirst="0" w:colLast="0"/>
+      <w:bookmarkEnd w:id="28"/>
     </w:p>
     <w:p>
       <w:pPr>
@@ -7929,8 +7921,8 @@
           <w:lang w:val="es-CO"/>
         </w:rPr>
       </w:pPr>
-      <w:bookmarkStart w:id="30" w:name="_wooymd6kgvc4" w:colFirst="0" w:colLast="0"/>
-      <w:bookmarkEnd w:id="30"/>
+      <w:bookmarkStart w:id="29" w:name="_wooymd6kgvc4" w:colFirst="0" w:colLast="0"/>
+      <w:bookmarkEnd w:id="29"/>
       <w:r>
         <w:rPr>
           <w:lang w:val="es-CO"/>
@@ -8202,8 +8194,8 @@
           <w:lang w:val="es-CO"/>
         </w:rPr>
       </w:pPr>
-      <w:bookmarkStart w:id="31" w:name="_426qo2qc4zri" w:colFirst="0" w:colLast="0"/>
-      <w:bookmarkEnd w:id="31"/>
+      <w:bookmarkStart w:id="30" w:name="_426qo2qc4zri" w:colFirst="0" w:colLast="0"/>
+      <w:bookmarkEnd w:id="30"/>
       <w:r>
         <w:rPr>
           <w:b/>
@@ -8555,12 +8547,12 @@
         </w:rPr>
         <w:t xml:space="preserve"> permite una clara separación entre la lógica de negocio, el acceso a datos y la interfaz de usuario. Esta arquitectura facilita el mantenimiento del sistema, mejora la organización del código y permite la incorporación de nuevas funcionalidades de manera estructurada.</w:t>
       </w:r>
-      <w:bookmarkStart w:id="32" w:name="_8kjbll1mdemy" w:colFirst="0" w:colLast="0"/>
-      <w:bookmarkStart w:id="33" w:name="_918osefs915v" w:colFirst="0" w:colLast="0"/>
-      <w:bookmarkStart w:id="34" w:name="_2m6qzi74x14" w:colFirst="0" w:colLast="0"/>
+      <w:bookmarkStart w:id="31" w:name="_8kjbll1mdemy" w:colFirst="0" w:colLast="0"/>
+      <w:bookmarkStart w:id="32" w:name="_918osefs915v" w:colFirst="0" w:colLast="0"/>
+      <w:bookmarkStart w:id="33" w:name="_2m6qzi74x14" w:colFirst="0" w:colLast="0"/>
+      <w:bookmarkEnd w:id="31"/>
       <w:bookmarkEnd w:id="32"/>
       <w:bookmarkEnd w:id="33"/>
-      <w:bookmarkEnd w:id="34"/>
     </w:p>
     <w:p>
       <w:pPr>
@@ -8572,10 +8564,10 @@
           <w:lang w:val="es-CO"/>
         </w:rPr>
       </w:pPr>
-      <w:bookmarkStart w:id="35" w:name="_r9mleiythy79" w:colFirst="0" w:colLast="0"/>
-      <w:bookmarkStart w:id="36" w:name="_sxgihj2fdkjp" w:colFirst="0" w:colLast="0"/>
+      <w:bookmarkStart w:id="34" w:name="_r9mleiythy79" w:colFirst="0" w:colLast="0"/>
+      <w:bookmarkStart w:id="35" w:name="_sxgihj2fdkjp" w:colFirst="0" w:colLast="0"/>
+      <w:bookmarkEnd w:id="34"/>
       <w:bookmarkEnd w:id="35"/>
-      <w:bookmarkEnd w:id="36"/>
       <w:r>
         <w:rPr>
           <w:lang w:val="es-CO"/>
@@ -8601,21 +8593,20 @@
         <w:rPr>
           <w:lang w:val="es-CO"/>
         </w:rPr>
-        <w:t xml:space="preserve">Para asegurar el correcto funcionamiento y desarrollo del proyecto </w:t>
-      </w:r>
-      <w:proofErr w:type="spellStart"/>
-      <w:r>
-        <w:rPr>
-          <w:lang w:val="es-CO"/>
-        </w:rPr>
-        <w:t>NombreProyecto</w:t>
-      </w:r>
-      <w:proofErr w:type="spellEnd"/>
-      <w:r>
-        <w:rPr>
-          <w:lang w:val="es-CO"/>
-        </w:rPr>
-        <w:t xml:space="preserve">, es fundamental cumplir con una serie de requisitos de software y hardware. Estos requisitos están diseñados para proporcionar un entorno de desarrollo consistente y un rendimiento óptimo en producción. </w:t>
+        <w:t xml:space="preserve">Para garantizar el correcto funcionamiento del sistema </w:t>
+      </w:r>
+      <w:r>
+        <w:rPr>
+          <w:b/>
+          <w:lang w:val="es-CO"/>
+        </w:rPr>
+        <w:t>SENA Contigo</w:t>
+      </w:r>
+      <w:r>
+        <w:rPr>
+          <w:lang w:val="es-CO"/>
+        </w:rPr>
+        <w:t>, es necesario contar con ciertos requisitos de software y hardware que permitan el desarrollo, ejecución y despliegue de la aplicación web. Estos requerimientos aseguran un entorno estable para el desarrollo del proyecto y un rendimiento adecuado durante su uso.</w:t>
       </w:r>
     </w:p>
     <w:p>
@@ -8628,98 +8619,215 @@
           <w:lang w:val="es-CO"/>
         </w:rPr>
       </w:pPr>
-      <w:bookmarkStart w:id="37" w:name="_x9nea6mbmshv" w:colFirst="0" w:colLast="0"/>
-      <w:bookmarkEnd w:id="37"/>
-      <w:r>
-        <w:rPr>
-          <w:lang w:val="es-CO"/>
-        </w:rPr>
-        <w:t xml:space="preserve">9.1. Software </w:t>
-      </w:r>
-    </w:p>
-    <w:p>
-      <w:pPr>
-        <w:rPr>
-          <w:lang w:val="es-CO"/>
-        </w:rPr>
-      </w:pPr>
-    </w:p>
-    <w:p>
-      <w:pPr>
-        <w:rPr>
-          <w:lang w:val="es-CO"/>
-        </w:rPr>
-      </w:pPr>
-      <w:r>
-        <w:rPr>
-          <w:lang w:val="es-CO"/>
-        </w:rPr>
-        <w:t xml:space="preserve">Los siguientes componentes de software son necesarios para el desarrollo y la ejecución de </w:t>
-      </w:r>
-      <w:proofErr w:type="spellStart"/>
-      <w:r>
-        <w:rPr>
-          <w:lang w:val="es-CO"/>
-        </w:rPr>
-        <w:t>NombreProyecto</w:t>
-      </w:r>
-      <w:proofErr w:type="spellEnd"/>
-      <w:r>
-        <w:rPr>
+      <w:bookmarkStart w:id="36" w:name="_x9nea6mbmshv" w:colFirst="0" w:colLast="0"/>
+      <w:bookmarkEnd w:id="36"/>
+      <w:r>
+        <w:rPr>
+          <w:lang w:val="es-CO"/>
+        </w:rPr>
+        <w:t>9.1 Requerimientos de Software</w:t>
+      </w:r>
+    </w:p>
+    <w:p>
+      <w:pPr>
+        <w:rPr>
+          <w:lang w:val="es-CO"/>
+        </w:rPr>
+      </w:pPr>
+    </w:p>
+    <w:p>
+      <w:pPr>
+        <w:rPr>
+          <w:lang w:val="es-CO"/>
+        </w:rPr>
+      </w:pPr>
+      <w:r>
+        <w:rPr>
+          <w:lang w:val="es-CO"/>
+        </w:rPr>
+        <w:t xml:space="preserve">Los siguientes componentes de software son necesarios para el desarrollo y ejecución del sistema </w:t>
+      </w:r>
+      <w:r>
+        <w:rPr>
+          <w:b/>
+          <w:lang w:val="es-CO"/>
+        </w:rPr>
+        <w:t>SENA Contigo</w:t>
+      </w:r>
+      <w:r>
+        <w:rPr>
+          <w:lang w:val="es-CO"/>
+        </w:rPr>
+        <w:t>:</w:t>
+      </w:r>
+    </w:p>
+    <w:p>
+      <w:pPr>
+        <w:rPr>
+          <w:lang w:val="es-CO"/>
+        </w:rPr>
+      </w:pPr>
+    </w:p>
+    <w:p>
+      <w:pPr>
+        <w:rPr>
+          <w:lang w:val="es-CO"/>
+        </w:rPr>
+      </w:pPr>
+      <w:r>
+        <w:rPr>
+          <w:b/>
+          <w:bCs/>
+          <w:lang w:val="es-CO"/>
+        </w:rPr>
+        <w:t>PHP</w:t>
+      </w:r>
+      <w:r>
+        <w:rPr>
+          <w:b/>
+          <w:bCs/>
+          <w:lang w:val="es-CO"/>
+        </w:rPr>
+        <w:t>:</w:t>
+      </w:r>
+      <w:r>
+        <w:rPr>
+          <w:lang w:val="es-CO"/>
+        </w:rPr>
+        <w:t xml:space="preserve"> </w:t>
+      </w:r>
+      <w:r>
+        <w:rPr>
+          <w:lang w:val="es-CO"/>
+        </w:rPr>
+        <w:t>Se requiere PHP versión 8.0 o superior, ya que es el lenguaje de programación utilizado para desarrollar la lógica del sistema bajo el patrón de arquitectura MVC (Modelo – Vista – Controlador).</w:t>
+      </w:r>
+    </w:p>
+    <w:p>
+      <w:pPr>
+        <w:rPr>
+          <w:lang w:val="es-CO"/>
+        </w:rPr>
+      </w:pPr>
+    </w:p>
+    <w:p>
+      <w:pPr>
+        <w:rPr>
+          <w:lang w:val="es-CO"/>
+        </w:rPr>
+      </w:pPr>
+      <w:r>
+        <w:rPr>
+          <w:lang w:val="es-CO"/>
+        </w:rPr>
+        <w:t>PHP permite procesar las solicitudes del usuario, gestionar la lógica de negocio y comunicarse con la base de datos.</w:t>
+      </w:r>
+    </w:p>
+    <w:p>
+      <w:pPr>
+        <w:rPr>
+          <w:lang w:val="es-CO"/>
+        </w:rPr>
+      </w:pPr>
+    </w:p>
+    <w:p>
+      <w:pPr>
+        <w:rPr>
+          <w:lang w:val="es-CO"/>
+        </w:rPr>
+      </w:pPr>
+      <w:r>
+        <w:rPr>
+          <w:b/>
+          <w:bCs/>
+          <w:lang w:val="es-CO"/>
+        </w:rPr>
+        <w:t>Servidor Web (Apache)</w:t>
+      </w:r>
+      <w:r>
+        <w:rPr>
+          <w:b/>
+          <w:bCs/>
           <w:lang w:val="es-CO"/>
         </w:rPr>
         <w:t xml:space="preserve">: </w:t>
       </w:r>
-    </w:p>
-    <w:p>
-      <w:pPr>
-        <w:rPr>
-          <w:lang w:val="es-CO"/>
-        </w:rPr>
-      </w:pPr>
-    </w:p>
-    <w:p>
-      <w:pPr>
-        <w:rPr>
-          <w:lang w:val="es-CO"/>
-        </w:rPr>
-      </w:pPr>
-      <w:r>
-        <w:rPr>
-          <w:b/>
-          <w:bCs/>
-          <w:lang w:val="es-CO"/>
-        </w:rPr>
-        <w:t>Node.js:</w:t>
-      </w:r>
-      <w:r>
-        <w:rPr>
-          <w:lang w:val="es-CO"/>
-        </w:rPr>
-        <w:t xml:space="preserve"> Se requiere la versión 18.17 o superior. Node.js es el entorno de ejecución de JavaScript que permite ejecutar el código del lado del servidor de Next.js y las herramientas de desarrollo. </w:t>
-      </w:r>
-    </w:p>
-    <w:p>
-      <w:pPr>
-        <w:rPr>
-          <w:lang w:val="es-CO"/>
-        </w:rPr>
-      </w:pPr>
-    </w:p>
-    <w:p>
-      <w:pPr>
-        <w:rPr>
-          <w:lang w:val="es-CO"/>
-        </w:rPr>
-      </w:pPr>
-      <w:proofErr w:type="spellStart"/>
-      <w:r>
-        <w:rPr>
-          <w:b/>
-          <w:bCs/>
-          <w:lang w:val="es-CO"/>
-        </w:rPr>
-        <w:t>pnpm</w:t>
+      <w:r>
+        <w:rPr>
+          <w:lang w:val="es-CO"/>
+        </w:rPr>
+        <w:t>El sistema requiere un servidor web como Apache, el cual permite interpretar los archivos PHP y gestionar las solicitudes HTTP realizadas por los usuarios desde el navegador.</w:t>
+      </w:r>
+    </w:p>
+    <w:p>
+      <w:pPr>
+        <w:rPr>
+          <w:lang w:val="es-CO"/>
+        </w:rPr>
+      </w:pPr>
+    </w:p>
+    <w:p>
+      <w:pPr>
+        <w:rPr>
+          <w:lang w:val="es-CO"/>
+        </w:rPr>
+      </w:pPr>
+      <w:r>
+        <w:rPr>
+          <w:lang w:val="es-CO"/>
+        </w:rPr>
+        <w:t>Durante el desarrollo se puede utilizar entornos como:</w:t>
+      </w:r>
+    </w:p>
+    <w:p>
+      <w:pPr>
+        <w:rPr>
+          <w:lang w:val="es-CO"/>
+        </w:rPr>
+      </w:pPr>
+    </w:p>
+    <w:p>
+      <w:pPr>
+        <w:pStyle w:val="Prrafodelista"/>
+        <w:numPr>
+          <w:ilvl w:val="0"/>
+          <w:numId w:val="14"/>
+        </w:numPr>
+        <w:rPr>
+          <w:lang w:val="es-CO"/>
+        </w:rPr>
+      </w:pPr>
+      <w:r>
+        <w:t>XAMPP</w:t>
+      </w:r>
+      <w:r>
+        <w:rPr>
+          <w:lang w:val="es-CO"/>
+        </w:rPr>
+        <w:t xml:space="preserve"> </w:t>
+      </w:r>
+    </w:p>
+    <w:p>
+      <w:pPr>
+        <w:rPr>
+          <w:lang w:val="es-CO"/>
+        </w:rPr>
+      </w:pPr>
+    </w:p>
+    <w:p>
+      <w:pPr>
+        <w:rPr>
+          <w:lang w:val="es-CO"/>
+        </w:rPr>
+      </w:pPr>
+      <w:proofErr w:type="spellStart"/>
+      <w:r>
+        <w:rPr>
+          <w:b/>
+          <w:bCs/>
+          <w:lang w:val="es-CO"/>
+        </w:rPr>
+        <w:t>PostgreSQL</w:t>
       </w:r>
       <w:proofErr w:type="spellEnd"/>
       <w:r>
@@ -8734,83 +8842,11 @@
         <w:rPr>
           <w:lang w:val="es-CO"/>
         </w:rPr>
-        <w:t xml:space="preserve">Aunque </w:t>
-      </w:r>
-      <w:proofErr w:type="spellStart"/>
-      <w:r>
-        <w:rPr>
-          <w:lang w:val="es-CO"/>
-        </w:rPr>
-        <w:t>npm</w:t>
-      </w:r>
-      <w:proofErr w:type="spellEnd"/>
-      <w:r>
-        <w:rPr>
-          <w:lang w:val="es-CO"/>
-        </w:rPr>
-        <w:t xml:space="preserve"> o </w:t>
-      </w:r>
-      <w:proofErr w:type="spellStart"/>
-      <w:r>
-        <w:rPr>
-          <w:lang w:val="es-CO"/>
-        </w:rPr>
-        <w:t>yarn</w:t>
-      </w:r>
-      <w:proofErr w:type="spellEnd"/>
-      <w:r>
-        <w:rPr>
-          <w:lang w:val="es-CO"/>
-        </w:rPr>
-        <w:t xml:space="preserve"> también son compatibles, se recomienda encarecidamente el uso de </w:t>
-      </w:r>
-      <w:proofErr w:type="spellStart"/>
-      <w:r>
-        <w:rPr>
-          <w:lang w:val="es-CO"/>
-        </w:rPr>
-        <w:t>pnpm</w:t>
-      </w:r>
-      <w:proofErr w:type="spellEnd"/>
-      <w:r>
-        <w:rPr>
-          <w:lang w:val="es-CO"/>
-        </w:rPr>
-        <w:t xml:space="preserve"> como gestor de paquetes. </w:t>
-      </w:r>
-      <w:proofErr w:type="spellStart"/>
-      <w:r>
-        <w:rPr>
-          <w:lang w:val="es-CO"/>
-        </w:rPr>
-        <w:t>pnpm</w:t>
-      </w:r>
-      <w:proofErr w:type="spellEnd"/>
-      <w:r>
-        <w:rPr>
-          <w:lang w:val="es-CO"/>
-        </w:rPr>
-        <w:t xml:space="preserve"> es conocido por su eficiencia en el uso del espacio en disco y su velocidad en la instalación de dependencias. </w:t>
-      </w:r>
-    </w:p>
-    <w:p>
-      <w:pPr>
-        <w:rPr>
-          <w:lang w:val="es-CO"/>
-        </w:rPr>
-      </w:pPr>
-    </w:p>
-    <w:p>
-      <w:pPr>
-        <w:rPr>
-          <w:lang w:val="es-CO"/>
-        </w:rPr>
-      </w:pPr>
-      <w:proofErr w:type="spellStart"/>
-      <w:r>
-        <w:rPr>
-          <w:b/>
-          <w:bCs/>
+        <w:t xml:space="preserve">El sistema utiliza </w:t>
+      </w:r>
+      <w:proofErr w:type="spellStart"/>
+      <w:r>
+        <w:rPr>
           <w:lang w:val="es-CO"/>
         </w:rPr>
         <w:t>PostgreSQL</w:t>
@@ -8818,31 +8854,359 @@
       <w:proofErr w:type="spellEnd"/>
       <w:r>
         <w:rPr>
-          <w:b/>
-          <w:bCs/>
+          <w:lang w:val="es-CO"/>
+        </w:rPr>
+        <w:t xml:space="preserve"> versión 14 o superior como gestor de base de datos relacional.</w:t>
+      </w:r>
+    </w:p>
+    <w:p>
+      <w:pPr>
+        <w:rPr>
+          <w:lang w:val="es-CO"/>
+        </w:rPr>
+      </w:pPr>
+    </w:p>
+    <w:p>
+      <w:pPr>
+        <w:rPr>
+          <w:lang w:val="es-CO"/>
+        </w:rPr>
+      </w:pPr>
+      <w:r>
+        <w:rPr>
+          <w:lang w:val="es-CO"/>
+        </w:rPr>
+        <w:t>Esta base de datos permite almacenar y gestionar la información del sistema, incluyendo:</w:t>
+      </w:r>
+    </w:p>
+    <w:p>
+      <w:pPr>
+        <w:rPr>
+          <w:lang w:val="es-CO"/>
+        </w:rPr>
+      </w:pPr>
+    </w:p>
+    <w:p>
+      <w:pPr>
+        <w:pStyle w:val="Prrafodelista"/>
+        <w:numPr>
+          <w:ilvl w:val="0"/>
+          <w:numId w:val="14"/>
+        </w:numPr>
+        <w:rPr>
+          <w:lang w:val="es-CO"/>
+        </w:rPr>
+      </w:pPr>
+      <w:r>
+        <w:rPr>
+          <w:lang w:val="es-CO"/>
+        </w:rPr>
+        <w:t>Usuarios</w:t>
+      </w:r>
+    </w:p>
+    <w:p>
+      <w:pPr>
+        <w:pStyle w:val="Prrafodelista"/>
+        <w:numPr>
+          <w:ilvl w:val="0"/>
+          <w:numId w:val="14"/>
+        </w:numPr>
+        <w:rPr>
+          <w:lang w:val="es-CO"/>
+        </w:rPr>
+      </w:pPr>
+      <w:r>
+        <w:rPr>
+          <w:lang w:val="es-CO"/>
+        </w:rPr>
+        <w:t>Programas de formación</w:t>
+      </w:r>
+    </w:p>
+    <w:p>
+      <w:pPr>
+        <w:pStyle w:val="Prrafodelista"/>
+        <w:numPr>
+          <w:ilvl w:val="0"/>
+          <w:numId w:val="14"/>
+        </w:numPr>
+        <w:rPr>
+          <w:lang w:val="es-CO"/>
+        </w:rPr>
+      </w:pPr>
+      <w:r>
+        <w:rPr>
+          <w:lang w:val="es-CO"/>
+        </w:rPr>
+        <w:t>Grupos o fichas</w:t>
+      </w:r>
+    </w:p>
+    <w:p>
+      <w:pPr>
+        <w:pStyle w:val="Prrafodelista"/>
+        <w:numPr>
+          <w:ilvl w:val="0"/>
+          <w:numId w:val="14"/>
+        </w:numPr>
+        <w:rPr>
+          <w:lang w:val="es-CO"/>
+        </w:rPr>
+      </w:pPr>
+      <w:r>
+        <w:rPr>
+          <w:lang w:val="es-CO"/>
+        </w:rPr>
+        <w:t>Aprendices</w:t>
+      </w:r>
+    </w:p>
+    <w:p>
+      <w:pPr>
+        <w:pStyle w:val="Prrafodelista"/>
+        <w:numPr>
+          <w:ilvl w:val="0"/>
+          <w:numId w:val="14"/>
+        </w:numPr>
+        <w:rPr>
+          <w:lang w:val="es-CO"/>
+        </w:rPr>
+      </w:pPr>
+      <w:r>
+        <w:rPr>
+          <w:lang w:val="es-CO"/>
+        </w:rPr>
+        <w:t>Reportes de riesgo</w:t>
+      </w:r>
+    </w:p>
+    <w:p>
+      <w:pPr>
+        <w:pStyle w:val="Prrafodelista"/>
+        <w:numPr>
+          <w:ilvl w:val="0"/>
+          <w:numId w:val="14"/>
+        </w:numPr>
+        <w:rPr>
+          <w:lang w:val="es-CO"/>
+        </w:rPr>
+      </w:pPr>
+      <w:r>
+        <w:rPr>
+          <w:lang w:val="es-CO"/>
+        </w:rPr>
+        <w:t>Estrategias de intervención</w:t>
+      </w:r>
+    </w:p>
+    <w:p>
+      <w:pPr>
+        <w:pStyle w:val="Prrafodelista"/>
+        <w:numPr>
+          <w:ilvl w:val="0"/>
+          <w:numId w:val="14"/>
+        </w:numPr>
+        <w:rPr>
+          <w:lang w:val="es-CO"/>
+        </w:rPr>
+      </w:pPr>
+      <w:r>
+        <w:rPr>
+          <w:lang w:val="es-CO"/>
+        </w:rPr>
+        <w:t>Historial de seguimiento</w:t>
+      </w:r>
+    </w:p>
+    <w:p>
+      <w:pPr>
+        <w:rPr>
+          <w:lang w:val="es-CO"/>
+        </w:rPr>
+      </w:pPr>
+    </w:p>
+    <w:p>
+      <w:pPr>
+        <w:rPr>
+          <w:lang w:val="es-CO"/>
+        </w:rPr>
+      </w:pPr>
+      <w:r>
+        <w:rPr>
+          <w:lang w:val="es-CO"/>
+        </w:rPr>
+        <w:t xml:space="preserve">La conexión entre la aplicación y la base de datos se realiza mediante PDO (PHP Data </w:t>
+      </w:r>
+      <w:proofErr w:type="spellStart"/>
+      <w:r>
+        <w:rPr>
+          <w:lang w:val="es-CO"/>
+        </w:rPr>
+        <w:t>Objects</w:t>
+      </w:r>
+      <w:proofErr w:type="spellEnd"/>
+      <w:r>
+        <w:rPr>
+          <w:lang w:val="es-CO"/>
+        </w:rPr>
+        <w:t>)</w:t>
+      </w:r>
+      <w:r>
+        <w:rPr>
+          <w:lang w:val="es-CO"/>
+        </w:rPr>
+        <w:t xml:space="preserve"> del archivo </w:t>
+      </w:r>
+      <w:proofErr w:type="spellStart"/>
+      <w:r>
+        <w:rPr>
+          <w:lang w:val="es-CO"/>
+        </w:rPr>
+        <w:t>Config</w:t>
+      </w:r>
+      <w:proofErr w:type="spellEnd"/>
+      <w:r>
+        <w:rPr>
+          <w:lang w:val="es-CO"/>
+        </w:rPr>
+        <w:t xml:space="preserve"> y el Modelo</w:t>
+      </w:r>
+      <w:r>
+        <w:rPr>
+          <w:lang w:val="es-CO"/>
+        </w:rPr>
+        <w:t>.</w:t>
+      </w:r>
+    </w:p>
+    <w:p>
+      <w:pPr>
+        <w:rPr>
+          <w:lang w:val="es-CO"/>
+        </w:rPr>
+      </w:pPr>
+      <w:proofErr w:type="spellStart"/>
+      <w:r>
+        <w:rPr>
+          <w:b/>
+          <w:lang w:val="es-CO"/>
+        </w:rPr>
+        <w:lastRenderedPageBreak/>
+        <w:t>Composer</w:t>
+      </w:r>
+      <w:proofErr w:type="spellEnd"/>
+      <w:r>
+        <w:rPr>
+          <w:b/>
           <w:lang w:val="es-CO"/>
         </w:rPr>
         <w:t xml:space="preserve">: </w:t>
       </w:r>
-      <w:r>
-        <w:rPr>
-          <w:lang w:val="es-CO"/>
-        </w:rPr>
-        <w:t xml:space="preserve">Se necesita la versión 14 o superior de </w:t>
-      </w:r>
-      <w:proofErr w:type="spellStart"/>
-      <w:r>
-        <w:rPr>
-          <w:lang w:val="es-CO"/>
-        </w:rPr>
-        <w:t>PostgreSQL</w:t>
-      </w:r>
-      <w:proofErr w:type="spellEnd"/>
-      <w:r>
-        <w:rPr>
-          <w:lang w:val="es-CO"/>
-        </w:rPr>
-        <w:t xml:space="preserve">. Esta base de datos relacional es utilizada por Prisma para almacenar toda la información transaccional y de usuarios de la aplicación. </w:t>
+      <w:proofErr w:type="spellStart"/>
+      <w:r>
+        <w:rPr>
+          <w:lang w:val="es-CO"/>
+        </w:rPr>
+        <w:t>Composer</w:t>
+      </w:r>
+      <w:proofErr w:type="spellEnd"/>
+      <w:r>
+        <w:rPr>
+          <w:lang w:val="es-CO"/>
+        </w:rPr>
+        <w:t xml:space="preserve"> es el gestor de dependencias utilizado en el proyecto para instalar y administrar librerías externas necesarias para el funcionamiento del sistema.</w:t>
+      </w:r>
+    </w:p>
+    <w:p>
+      <w:pPr>
+        <w:rPr>
+          <w:lang w:val="es-CO"/>
+        </w:rPr>
+      </w:pPr>
+    </w:p>
+    <w:p>
+      <w:pPr>
+        <w:rPr>
+          <w:lang w:val="es-CO"/>
+        </w:rPr>
+      </w:pPr>
+      <w:r>
+        <w:rPr>
+          <w:lang w:val="es-CO"/>
+        </w:rPr>
+        <w:t xml:space="preserve">Entre las librerías instaladas mediante </w:t>
+      </w:r>
+      <w:proofErr w:type="spellStart"/>
+      <w:r>
+        <w:rPr>
+          <w:lang w:val="es-CO"/>
+        </w:rPr>
+        <w:t>Composer</w:t>
+      </w:r>
+      <w:proofErr w:type="spellEnd"/>
+      <w:r>
+        <w:rPr>
+          <w:lang w:val="es-CO"/>
+        </w:rPr>
+        <w:t xml:space="preserve"> se encuentran:</w:t>
+      </w:r>
+    </w:p>
+    <w:p>
+      <w:pPr>
+        <w:rPr>
+          <w:lang w:val="es-CO"/>
+        </w:rPr>
+      </w:pPr>
+    </w:p>
+    <w:p>
+      <w:pPr>
+        <w:pStyle w:val="Prrafodelista"/>
+        <w:numPr>
+          <w:ilvl w:val="0"/>
+          <w:numId w:val="15"/>
+        </w:numPr>
+        <w:rPr>
+          <w:lang w:val="es-CO"/>
+        </w:rPr>
+      </w:pPr>
+      <w:proofErr w:type="spellStart"/>
+      <w:r>
+        <w:rPr>
+          <w:lang w:val="es-CO"/>
+        </w:rPr>
+        <w:t>PHPMailer</w:t>
+      </w:r>
+      <w:proofErr w:type="spellEnd"/>
+      <w:r>
+        <w:rPr>
+          <w:lang w:val="es-CO"/>
+        </w:rPr>
+        <w:t xml:space="preserve"> </w:t>
+      </w:r>
+      <w:r>
+        <w:rPr>
+          <w:lang w:val="es-CO"/>
+        </w:rPr>
+        <w:t>(envío de correos electrónicos)</w:t>
+      </w:r>
+    </w:p>
+    <w:p>
+      <w:pPr>
+        <w:pStyle w:val="Prrafodelista"/>
+        <w:numPr>
+          <w:ilvl w:val="0"/>
+          <w:numId w:val="15"/>
+        </w:numPr>
+        <w:rPr>
+          <w:lang w:val="es-CO"/>
+        </w:rPr>
+      </w:pPr>
+      <w:proofErr w:type="spellStart"/>
+      <w:r>
+        <w:rPr>
+          <w:lang w:val="es-CO"/>
+        </w:rPr>
+        <w:t>PhpSpreadsheet</w:t>
+      </w:r>
+      <w:proofErr w:type="spellEnd"/>
+      <w:r>
+        <w:rPr>
+          <w:lang w:val="es-CO"/>
+        </w:rPr>
+        <w:t xml:space="preserve"> (importación y exportación de archivos Excel)</w:t>
       </w:r>
     </w:p>
     <w:p>
@@ -8880,7 +9244,41 @@
         <w:rPr>
           <w:lang w:val="es-CO"/>
         </w:rPr>
-        <w:t xml:space="preserve"> Es indispensable para el control de versiones del código fuente. Permite clonar el repositorio, gestionar los cambios y colaborar con otros desarrolladores. </w:t>
+        <w:t xml:space="preserve"> </w:t>
+      </w:r>
+      <w:proofErr w:type="spellStart"/>
+      <w:r>
+        <w:rPr>
+          <w:lang w:val="es-CO"/>
+        </w:rPr>
+        <w:t>Git</w:t>
+      </w:r>
+      <w:proofErr w:type="spellEnd"/>
+      <w:r>
+        <w:rPr>
+          <w:lang w:val="es-CO"/>
+        </w:rPr>
+        <w:t xml:space="preserve"> es el sistema de control de versiones utilizado para gestionar el código fuente del proyecto.</w:t>
+      </w:r>
+    </w:p>
+    <w:p>
+      <w:pPr>
+        <w:rPr>
+          <w:lang w:val="es-CO"/>
+        </w:rPr>
+      </w:pPr>
+    </w:p>
+    <w:p>
+      <w:pPr>
+        <w:rPr>
+          <w:lang w:val="es-CO"/>
+        </w:rPr>
+      </w:pPr>
+      <w:r>
+        <w:rPr>
+          <w:lang w:val="es-CO"/>
+        </w:rPr>
+        <w:t>Permite llevar un registro de los cambios realizados en el sistema, facilitar el trabajo colaborativo entre desarrolladores y mantener un historial de versiones del software.</w:t>
       </w:r>
     </w:p>
     <w:p>
@@ -8896,7 +9294,146 @@
         <w:spacing w:before="470" w:line="240" w:lineRule="auto"/>
         <w:ind w:left="13"/>
         <w:rPr>
-          <w:rFonts w:ascii="Noto Sans" w:eastAsia="Noto Sans" w:hAnsi="Noto Sans" w:cs="Noto Sans"/>
+          <w:lang w:val="es-CO"/>
+        </w:rPr>
+      </w:pPr>
+      <w:r>
+        <w:rPr>
+          <w:b/>
+          <w:lang w:val="es-CO"/>
+        </w:rPr>
+        <w:t>Navegador Web</w:t>
+      </w:r>
+      <w:r>
+        <w:rPr>
+          <w:b/>
+          <w:lang w:val="es-CO"/>
+        </w:rPr>
+        <w:t xml:space="preserve">: </w:t>
+      </w:r>
+      <w:r>
+        <w:rPr>
+          <w:lang w:val="es-CO"/>
+        </w:rPr>
+        <w:t xml:space="preserve">Para acceder al sistema se requiere un navegador web moderno compatible con los estándares actuales de desarrollo web, </w:t>
+      </w:r>
+      <w:r>
+        <w:rPr>
+          <w:lang w:val="es-CO"/>
+        </w:rPr>
+        <w:t>como,</w:t>
+      </w:r>
+      <w:r>
+        <w:rPr>
+          <w:lang w:val="es-CO"/>
+        </w:rPr>
+        <w:t xml:space="preserve"> por ejemplo:</w:t>
+      </w:r>
+    </w:p>
+    <w:p>
+      <w:pPr>
+        <w:pStyle w:val="Prrafodelista"/>
+        <w:widowControl w:val="0"/>
+        <w:numPr>
+          <w:ilvl w:val="0"/>
+          <w:numId w:val="16"/>
+        </w:numPr>
+        <w:pBdr>
+          <w:top w:val="nil"/>
+          <w:left w:val="nil"/>
+          <w:bottom w:val="nil"/>
+          <w:right w:val="nil"/>
+          <w:between w:val="nil"/>
+        </w:pBdr>
+        <w:spacing w:before="470" w:line="240" w:lineRule="auto"/>
+      </w:pPr>
+      <w:r>
+        <w:t>Google Chrome</w:t>
+      </w:r>
+    </w:p>
+    <w:p>
+      <w:pPr>
+        <w:pStyle w:val="Prrafodelista"/>
+        <w:widowControl w:val="0"/>
+        <w:numPr>
+          <w:ilvl w:val="0"/>
+          <w:numId w:val="16"/>
+        </w:numPr>
+        <w:pBdr>
+          <w:top w:val="nil"/>
+          <w:left w:val="nil"/>
+          <w:bottom w:val="nil"/>
+          <w:right w:val="nil"/>
+          <w:between w:val="nil"/>
+        </w:pBdr>
+        <w:spacing w:before="470" w:line="240" w:lineRule="auto"/>
+      </w:pPr>
+      <w:r>
+        <w:t>Mozilla Firefox</w:t>
+      </w:r>
+    </w:p>
+    <w:p>
+      <w:pPr>
+        <w:pStyle w:val="Prrafodelista"/>
+        <w:widowControl w:val="0"/>
+        <w:numPr>
+          <w:ilvl w:val="0"/>
+          <w:numId w:val="16"/>
+        </w:numPr>
+        <w:pBdr>
+          <w:top w:val="nil"/>
+          <w:left w:val="nil"/>
+          <w:bottom w:val="nil"/>
+          <w:right w:val="nil"/>
+          <w:between w:val="nil"/>
+        </w:pBdr>
+        <w:spacing w:before="470" w:line="240" w:lineRule="auto"/>
+      </w:pPr>
+      <w:r>
+        <w:t>Microsoft Edge</w:t>
+      </w:r>
+    </w:p>
+    <w:p>
+      <w:pPr>
+        <w:widowControl w:val="0"/>
+        <w:pBdr>
+          <w:top w:val="nil"/>
+          <w:left w:val="nil"/>
+          <w:bottom w:val="nil"/>
+          <w:right w:val="nil"/>
+          <w:between w:val="nil"/>
+        </w:pBdr>
+        <w:spacing w:before="470" w:line="240" w:lineRule="auto"/>
+        <w:rPr>
+          <w:lang w:val="es-CO"/>
+        </w:rPr>
+      </w:pPr>
+      <w:r>
+        <w:rPr>
+          <w:lang w:val="es-CO"/>
+        </w:rPr>
+        <w:t>Estos navegadores permiten ejecutar correctamente las funcionalidades desarrolladas con HTML, CSS y JavaScript.</w:t>
+      </w:r>
+    </w:p>
+    <w:p>
+      <w:pPr>
+        <w:widowControl w:val="0"/>
+        <w:pBdr>
+          <w:top w:val="nil"/>
+          <w:left w:val="nil"/>
+          <w:bottom w:val="nil"/>
+          <w:right w:val="nil"/>
+          <w:between w:val="nil"/>
+        </w:pBdr>
+        <w:spacing w:before="470" w:line="240" w:lineRule="auto"/>
+        <w:rPr>
+          <w:lang w:val="es-CO"/>
+        </w:rPr>
+      </w:pPr>
+    </w:p>
+    <w:p>
+      <w:pPr>
+        <w:rPr>
           <w:b/>
           <w:bCs/>
           <w:color w:val="333333"/>
@@ -8905,152 +9442,227 @@
           <w:lang w:val="es-CO"/>
         </w:rPr>
       </w:pPr>
-    </w:p>
-    <w:p>
-      <w:pPr>
-        <w:pStyle w:val="Ttulo2"/>
-        <w:widowControl w:val="0"/>
-        <w:spacing w:before="470"/>
-        <w:ind w:left="13"/>
-        <w:rPr>
-          <w:lang w:val="es-CO"/>
-        </w:rPr>
-      </w:pPr>
-      <w:bookmarkStart w:id="38" w:name="_bs9msp37u6ws" w:colFirst="0" w:colLast="0"/>
-      <w:bookmarkEnd w:id="38"/>
-      <w:r>
-        <w:rPr>
-          <w:lang w:val="es-CO"/>
-        </w:rPr>
-        <w:t xml:space="preserve">9.2. Hardware (Recomendado para Producción) </w:t>
-      </w:r>
-    </w:p>
-    <w:p>
-      <w:pPr>
-        <w:rPr>
-          <w:lang w:val="es-CO"/>
-        </w:rPr>
-      </w:pPr>
-      <w:r>
-        <w:rPr>
-          <w:lang w:val="es-CO"/>
-        </w:rPr>
-        <w:t>Para un despliegue en un entorno de producción que garantice un rendimiento adecuado y la capacidad de manejar la carga de usuarios, se recomiendan las siguientes especificaciones de hardware:</w:t>
-      </w:r>
-    </w:p>
-    <w:p>
-      <w:pPr>
-        <w:rPr>
-          <w:b/>
-          <w:bCs/>
-          <w:lang w:val="es-CO"/>
-        </w:rPr>
-      </w:pPr>
-    </w:p>
-    <w:p>
-      <w:pPr>
-        <w:rPr>
-          <w:lang w:val="es-CO"/>
-        </w:rPr>
-      </w:pPr>
-      <w:r>
-        <w:rPr>
-          <w:b/>
-          <w:bCs/>
-          <w:lang w:val="es-CO"/>
-        </w:rPr>
-        <w:t xml:space="preserve">CPU: </w:t>
-      </w:r>
-      <w:r>
-        <w:rPr>
-          <w:lang w:val="es-CO"/>
-        </w:rPr>
-        <w:t xml:space="preserve">Un procesador con 2 núcleos o más. Esto asegura la capacidad de procesamiento necesaria para manejar las solicitudes del servidor y las operaciones de la base de datos. </w:t>
-      </w:r>
-    </w:p>
-    <w:p>
-      <w:pPr>
-        <w:rPr>
-          <w:lang w:val="es-CO"/>
-        </w:rPr>
-      </w:pPr>
-    </w:p>
-    <w:p>
-      <w:pPr>
-        <w:rPr>
-          <w:lang w:val="es-CO"/>
-        </w:rPr>
-      </w:pPr>
-      <w:r>
-        <w:rPr>
-          <w:b/>
-          <w:bCs/>
-          <w:lang w:val="es-CO"/>
-        </w:rPr>
-        <w:t xml:space="preserve">RAM: </w:t>
-      </w:r>
-      <w:r>
-        <w:rPr>
-          <w:lang w:val="es-CO"/>
-        </w:rPr>
-        <w:t xml:space="preserve">4GB de memoria RAM o más. Una cantidad suficiente de memoria es crucial para el rendimiento de la aplicación, especialmente bajo carga, y para el funcionamiento eficiente de la base de datos. </w:t>
-      </w:r>
-    </w:p>
-    <w:p>
-      <w:pPr>
-        <w:rPr>
-          <w:lang w:val="es-CO"/>
-        </w:rPr>
-      </w:pPr>
-    </w:p>
-    <w:p>
-      <w:pPr>
-        <w:rPr>
-          <w:lang w:val="es-CO"/>
-        </w:rPr>
-      </w:pPr>
-      <w:r>
-        <w:rPr>
-          <w:b/>
+      <w:bookmarkStart w:id="37" w:name="_bs9msp37u6ws" w:colFirst="0" w:colLast="0"/>
+      <w:bookmarkEnd w:id="37"/>
+      <w:r>
+        <w:rPr>
+          <w:b/>
+          <w:bCs/>
+          <w:color w:val="333333"/>
+          <w:sz w:val="28"/>
+          <w:szCs w:val="28"/>
+          <w:lang w:val="es-CO"/>
+        </w:rPr>
+        <w:t>9.2 Requerimientos de Hardware (Recomendado)</w:t>
+      </w:r>
+      <w:r>
+        <w:rPr>
+          <w:b/>
+          <w:bCs/>
+          <w:color w:val="333333"/>
+          <w:sz w:val="28"/>
+          <w:szCs w:val="28"/>
+          <w:lang w:val="es-CO"/>
+        </w:rPr>
+        <w:t>:</w:t>
+      </w:r>
+    </w:p>
+    <w:p>
+      <w:pPr>
+        <w:rPr>
+          <w:b/>
+          <w:bCs/>
+          <w:color w:val="333333"/>
+          <w:sz w:val="28"/>
+          <w:szCs w:val="28"/>
+          <w:lang w:val="es-CO"/>
+        </w:rPr>
+      </w:pPr>
+    </w:p>
+    <w:p>
+      <w:pPr>
+        <w:rPr>
+          <w:lang w:val="es-CO"/>
+        </w:rPr>
+      </w:pPr>
+      <w:r>
+        <w:rPr>
+          <w:lang w:val="es-CO"/>
+        </w:rPr>
+        <w:t>Para garantizar un rendimiento adecuado del sistema, especialmente en entornos de producción, se recomienda contar con las siguientes especificaciones de hardware.</w:t>
+      </w:r>
+    </w:p>
+    <w:p>
+      <w:pPr>
+        <w:rPr>
+          <w:lang w:val="es-CO"/>
+        </w:rPr>
+      </w:pPr>
+    </w:p>
+    <w:p>
+      <w:pPr>
+        <w:rPr>
+          <w:b/>
+          <w:bCs/>
+          <w:lang w:val="es-CO"/>
+        </w:rPr>
+      </w:pPr>
+      <w:r>
+        <w:rPr>
+          <w:b/>
+          <w:bCs/>
+          <w:lang w:val="es-CO"/>
+        </w:rPr>
+        <w:t xml:space="preserve">Procesador (CPU): </w:t>
+      </w:r>
+      <w:r>
+        <w:rPr>
+          <w:bCs/>
+          <w:lang w:val="es-CO"/>
+        </w:rPr>
+        <w:t>Se recomienda un procesador con mínimo 2 núcleos, capaz de manejar múltiples solicitudes de usuarios y procesar las operaciones del servidor.</w:t>
+      </w:r>
+    </w:p>
+    <w:p>
+      <w:pPr>
+        <w:rPr>
+          <w:bCs/>
+          <w:lang w:val="es-CO"/>
+        </w:rPr>
+      </w:pPr>
+    </w:p>
+    <w:p>
+      <w:pPr>
+        <w:rPr>
+          <w:bCs/>
+          <w:lang w:val="es-CO"/>
+        </w:rPr>
+      </w:pPr>
+      <w:r>
+        <w:rPr>
+          <w:b/>
+          <w:bCs/>
+          <w:lang w:val="es-CO"/>
+        </w:rPr>
+        <w:t xml:space="preserve">Memoria RAM: </w:t>
+      </w:r>
+      <w:r>
+        <w:rPr>
+          <w:bCs/>
+          <w:lang w:val="es-CO"/>
+        </w:rPr>
+        <w:t>Se recomienda contar con mínimo 4 GB de memoria RAM, lo cual permite ejecutar correctamente el servidor web, la base de datos y los procesos del sistema sin afectar el rendimiento.</w:t>
+      </w:r>
+    </w:p>
+    <w:p>
+      <w:pPr>
+        <w:rPr>
+          <w:b/>
+          <w:bCs/>
+          <w:lang w:val="es-CO"/>
+        </w:rPr>
+      </w:pPr>
+    </w:p>
+    <w:p>
+      <w:pPr>
+        <w:rPr>
+          <w:b/>
+          <w:bCs/>
+          <w:lang w:val="es-CO"/>
+        </w:rPr>
+      </w:pPr>
+      <w:r>
+        <w:rPr>
+          <w:b/>
+          <w:bCs/>
+          <w:lang w:val="es-CO"/>
+        </w:rPr>
+        <w:t>Almacenamiento</w:t>
+      </w:r>
+      <w:r>
+        <w:rPr>
+          <w:b/>
+          <w:bCs/>
+          <w:lang w:val="es-CO"/>
+        </w:rPr>
+        <w:t xml:space="preserve">: </w:t>
+      </w:r>
+      <w:r>
+        <w:rPr>
+          <w:bCs/>
+          <w:lang w:val="es-CO"/>
+        </w:rPr>
+        <w:t>Se recomienda disponer de 20 GB de almacenamiento en disco SSD o superior.</w:t>
+      </w:r>
+    </w:p>
+    <w:p>
+      <w:pPr>
+        <w:rPr>
+          <w:bCs/>
+          <w:lang w:val="es-CO"/>
+        </w:rPr>
+      </w:pPr>
+    </w:p>
+    <w:p>
+      <w:pPr>
+        <w:rPr>
+          <w:bCs/>
+          <w:lang w:val="es-CO"/>
+        </w:rPr>
+      </w:pPr>
+      <w:r>
+        <w:rPr>
+          <w:bCs/>
+          <w:lang w:val="es-CO"/>
+        </w:rPr>
+        <w:t>El uso de unidades SSD mejora significativamente la velocidad de lectura y escritura de datos, lo cual beneficia el rendimiento del sistema y de la base de datos.</w:t>
+      </w:r>
+    </w:p>
+    <w:p>
+      <w:pPr>
+        <w:rPr>
+          <w:bCs/>
+          <w:lang w:val="es-CO"/>
+        </w:rPr>
+      </w:pPr>
+      <w:r>
+        <w:rPr>
           <w:bCs/>
           <w:lang w:val="es-CO"/>
         </w:rPr>
         <w:lastRenderedPageBreak/>
-        <w:t>Almacenamiento:</w:t>
-      </w:r>
-      <w:r>
-        <w:rPr>
-          <w:lang w:val="es-CO"/>
-        </w:rPr>
-        <w:t xml:space="preserve"> 20GB de almacenamiento SSD o superior. El uso de unidades de estado sólido (SSD) mejora significativamente los tiempos de lectura y escritura, lo que se traduce en una mayor velocidad de respuesta de la aplicación y de la base de datos. </w:t>
-      </w:r>
-    </w:p>
-    <w:p>
-      <w:pPr>
-        <w:rPr>
-          <w:lang w:val="es-CO"/>
-        </w:rPr>
-      </w:pPr>
-      <w:r>
-        <w:rPr>
-          <w:lang w:val="es-CO"/>
-        </w:rPr>
-        <w:t xml:space="preserve">Cumplir con estos requisitos es un paso fundamental para establecer un entorno de trabajo productivo y para asegurar la estabilidad y el rendimiento de </w:t>
-      </w:r>
-      <w:proofErr w:type="spellStart"/>
-      <w:r>
-        <w:rPr>
-          <w:lang w:val="es-CO"/>
-        </w:rPr>
-        <w:t>NombreProyecto</w:t>
-      </w:r>
-      <w:proofErr w:type="spellEnd"/>
-      <w:r>
-        <w:rPr>
-          <w:lang w:val="es-CO"/>
-        </w:rPr>
-        <w:t xml:space="preserve"> en sus diferentes fases. </w:t>
-      </w:r>
+        <w:t>Cumplir con estos requerimientos de software y hardware permite garantizar un entorno adecuado para el desarrollo, ejecución y despliegue del sistema SENA Contigo.</w:t>
+      </w:r>
+    </w:p>
+    <w:p>
+      <w:pPr>
+        <w:rPr>
+          <w:bCs/>
+          <w:lang w:val="es-CO"/>
+        </w:rPr>
+      </w:pPr>
+    </w:p>
+    <w:p>
+      <w:pPr>
+        <w:rPr>
+          <w:bCs/>
+          <w:lang w:val="es-CO"/>
+        </w:rPr>
+      </w:pPr>
+      <w:r>
+        <w:rPr>
+          <w:bCs/>
+          <w:lang w:val="es-CO"/>
+        </w:rPr>
+        <w:t>Estos requisitos aseguran que la aplicación pueda operar de manera estable, permitiendo gestionar la información académica de los aprendices y facilitar el seguimiento de los casos de riesgo de deserción dentro de la institución.</w:t>
+      </w:r>
+    </w:p>
+    <w:p>
+      <w:pPr>
+        <w:rPr>
+          <w:lang w:val="es-CO"/>
+        </w:rPr>
+      </w:pPr>
     </w:p>
     <w:p>
       <w:pPr>
@@ -9062,7 +9674,9 @@
           <w:lang w:val="es-CO"/>
         </w:rPr>
       </w:pPr>
-      <w:bookmarkStart w:id="39" w:name="_jdwerysxayrd" w:colFirst="0" w:colLast="0"/>
+      <w:bookmarkStart w:id="38" w:name="_jdwerysxayrd" w:colFirst="0" w:colLast="0"/>
+      <w:bookmarkStart w:id="39" w:name="_GoBack"/>
+      <w:bookmarkEnd w:id="38"/>
       <w:bookmarkEnd w:id="39"/>
       <w:r>
         <w:rPr>
@@ -9778,6 +10392,7 @@
           <w:szCs w:val="19"/>
           <w:lang w:val="es-CO"/>
         </w:rPr>
+        <w:lastRenderedPageBreak/>
         <w:t># Pasarela de Pagos (</w:t>
       </w:r>
       <w:proofErr w:type="spellStart"/>
@@ -9829,7 +10444,6 @@
           <w:sz w:val="19"/>
           <w:szCs w:val="19"/>
         </w:rPr>
-        <w:lastRenderedPageBreak/>
         <w:t>MERCADOPAGO_ACCESS_TOKEN</w:t>
       </w:r>
       <w:r>
@@ -14868,6 +15482,119 @@
     </w:lvl>
   </w:abstractNum>
   <w:abstractNum w:abstractNumId="6" w15:restartNumberingAfterBreak="0">
+    <w:nsid w:val="28C266A5"/>
+    <w:multiLevelType w:val="hybridMultilevel"/>
+    <w:tmpl w:val="418E6E24"/>
+    <w:lvl w:ilvl="0" w:tplc="04090001">
+      <w:start w:val="1"/>
+      <w:numFmt w:val="bullet"/>
+      <w:lvlText w:val=""/>
+      <w:lvlJc w:val="left"/>
+      <w:pPr>
+        <w:ind w:left="720" w:hanging="360"/>
+      </w:pPr>
+      <w:rPr>
+        <w:rFonts w:ascii="Symbol" w:hAnsi="Symbol" w:hint="default"/>
+      </w:rPr>
+    </w:lvl>
+    <w:lvl w:ilvl="1" w:tplc="04090003" w:tentative="1">
+      <w:start w:val="1"/>
+      <w:numFmt w:val="bullet"/>
+      <w:lvlText w:val="o"/>
+      <w:lvlJc w:val="left"/>
+      <w:pPr>
+        <w:ind w:left="1440" w:hanging="360"/>
+      </w:pPr>
+      <w:rPr>
+        <w:rFonts w:ascii="Courier New" w:hAnsi="Courier New" w:cs="Courier New" w:hint="default"/>
+      </w:rPr>
+    </w:lvl>
+    <w:lvl w:ilvl="2" w:tplc="04090005" w:tentative="1">
+      <w:start w:val="1"/>
+      <w:numFmt w:val="bullet"/>
+      <w:lvlText w:val=""/>
+      <w:lvlJc w:val="left"/>
+      <w:pPr>
+        <w:ind w:left="2160" w:hanging="360"/>
+      </w:pPr>
+      <w:rPr>
+        <w:rFonts w:ascii="Wingdings" w:hAnsi="Wingdings" w:hint="default"/>
+      </w:rPr>
+    </w:lvl>
+    <w:lvl w:ilvl="3" w:tplc="04090001" w:tentative="1">
+      <w:start w:val="1"/>
+      <w:numFmt w:val="bullet"/>
+      <w:lvlText w:val=""/>
+      <w:lvlJc w:val="left"/>
+      <w:pPr>
+        <w:ind w:left="2880" w:hanging="360"/>
+      </w:pPr>
+      <w:rPr>
+        <w:rFonts w:ascii="Symbol" w:hAnsi="Symbol" w:hint="default"/>
+      </w:rPr>
+    </w:lvl>
+    <w:lvl w:ilvl="4" w:tplc="04090003" w:tentative="1">
+      <w:start w:val="1"/>
+      <w:numFmt w:val="bullet"/>
+      <w:lvlText w:val="o"/>
+      <w:lvlJc w:val="left"/>
+      <w:pPr>
+        <w:ind w:left="3600" w:hanging="360"/>
+      </w:pPr>
+      <w:rPr>
+        <w:rFonts w:ascii="Courier New" w:hAnsi="Courier New" w:cs="Courier New" w:hint="default"/>
+      </w:rPr>
+    </w:lvl>
+    <w:lvl w:ilvl="5" w:tplc="04090005" w:tentative="1">
+      <w:start w:val="1"/>
+      <w:numFmt w:val="bullet"/>
+      <w:lvlText w:val=""/>
+      <w:lvlJc w:val="left"/>
+      <w:pPr>
+        <w:ind w:left="4320" w:hanging="360"/>
+      </w:pPr>
+      <w:rPr>
+        <w:rFonts w:ascii="Wingdings" w:hAnsi="Wingdings" w:hint="default"/>
+      </w:rPr>
+    </w:lvl>
+    <w:lvl w:ilvl="6" w:tplc="04090001" w:tentative="1">
+      <w:start w:val="1"/>
+      <w:numFmt w:val="bullet"/>
+      <w:lvlText w:val=""/>
+      <w:lvlJc w:val="left"/>
+      <w:pPr>
+        <w:ind w:left="5040" w:hanging="360"/>
+      </w:pPr>
+      <w:rPr>
+        <w:rFonts w:ascii="Symbol" w:hAnsi="Symbol" w:hint="default"/>
+      </w:rPr>
+    </w:lvl>
+    <w:lvl w:ilvl="7" w:tplc="04090003" w:tentative="1">
+      <w:start w:val="1"/>
+      <w:numFmt w:val="bullet"/>
+      <w:lvlText w:val="o"/>
+      <w:lvlJc w:val="left"/>
+      <w:pPr>
+        <w:ind w:left="5760" w:hanging="360"/>
+      </w:pPr>
+      <w:rPr>
+        <w:rFonts w:ascii="Courier New" w:hAnsi="Courier New" w:cs="Courier New" w:hint="default"/>
+      </w:rPr>
+    </w:lvl>
+    <w:lvl w:ilvl="8" w:tplc="04090005" w:tentative="1">
+      <w:start w:val="1"/>
+      <w:numFmt w:val="bullet"/>
+      <w:lvlText w:val=""/>
+      <w:lvlJc w:val="left"/>
+      <w:pPr>
+        <w:ind w:left="6480" w:hanging="360"/>
+      </w:pPr>
+      <w:rPr>
+        <w:rFonts w:ascii="Wingdings" w:hAnsi="Wingdings" w:hint="default"/>
+      </w:rPr>
+    </w:lvl>
+  </w:abstractNum>
+  <w:abstractNum w:abstractNumId="7" w15:restartNumberingAfterBreak="0">
     <w:nsid w:val="3C36244C"/>
     <w:multiLevelType w:val="multilevel"/>
     <w:tmpl w:val="6E66C814"/>
@@ -14980,7 +15707,7 @@
       </w:rPr>
     </w:lvl>
   </w:abstractNum>
-  <w:abstractNum w:abstractNumId="7" w15:restartNumberingAfterBreak="0">
+  <w:abstractNum w:abstractNumId="8" w15:restartNumberingAfterBreak="0">
     <w:nsid w:val="3D3D0CDD"/>
     <w:multiLevelType w:val="hybridMultilevel"/>
     <w:tmpl w:val="68A8911C"/>
@@ -15093,7 +15820,7 @@
       </w:rPr>
     </w:lvl>
   </w:abstractNum>
-  <w:abstractNum w:abstractNumId="8" w15:restartNumberingAfterBreak="0">
+  <w:abstractNum w:abstractNumId="9" w15:restartNumberingAfterBreak="0">
     <w:nsid w:val="4B8147D7"/>
     <w:multiLevelType w:val="hybridMultilevel"/>
     <w:tmpl w:val="A41EAEC4"/>
@@ -15179,7 +15906,120 @@
       </w:pPr>
     </w:lvl>
   </w:abstractNum>
-  <w:abstractNum w:abstractNumId="9" w15:restartNumberingAfterBreak="0">
+  <w:abstractNum w:abstractNumId="10" w15:restartNumberingAfterBreak="0">
+    <w:nsid w:val="519C0C98"/>
+    <w:multiLevelType w:val="hybridMultilevel"/>
+    <w:tmpl w:val="CA9A2BEA"/>
+    <w:lvl w:ilvl="0" w:tplc="04090001">
+      <w:start w:val="1"/>
+      <w:numFmt w:val="bullet"/>
+      <w:lvlText w:val=""/>
+      <w:lvlJc w:val="left"/>
+      <w:pPr>
+        <w:ind w:left="720" w:hanging="360"/>
+      </w:pPr>
+      <w:rPr>
+        <w:rFonts w:ascii="Symbol" w:hAnsi="Symbol" w:hint="default"/>
+      </w:rPr>
+    </w:lvl>
+    <w:lvl w:ilvl="1" w:tplc="04090003" w:tentative="1">
+      <w:start w:val="1"/>
+      <w:numFmt w:val="bullet"/>
+      <w:lvlText w:val="o"/>
+      <w:lvlJc w:val="left"/>
+      <w:pPr>
+        <w:ind w:left="1440" w:hanging="360"/>
+      </w:pPr>
+      <w:rPr>
+        <w:rFonts w:ascii="Courier New" w:hAnsi="Courier New" w:cs="Courier New" w:hint="default"/>
+      </w:rPr>
+    </w:lvl>
+    <w:lvl w:ilvl="2" w:tplc="04090005" w:tentative="1">
+      <w:start w:val="1"/>
+      <w:numFmt w:val="bullet"/>
+      <w:lvlText w:val=""/>
+      <w:lvlJc w:val="left"/>
+      <w:pPr>
+        <w:ind w:left="2160" w:hanging="360"/>
+      </w:pPr>
+      <w:rPr>
+        <w:rFonts w:ascii="Wingdings" w:hAnsi="Wingdings" w:hint="default"/>
+      </w:rPr>
+    </w:lvl>
+    <w:lvl w:ilvl="3" w:tplc="04090001" w:tentative="1">
+      <w:start w:val="1"/>
+      <w:numFmt w:val="bullet"/>
+      <w:lvlText w:val=""/>
+      <w:lvlJc w:val="left"/>
+      <w:pPr>
+        <w:ind w:left="2880" w:hanging="360"/>
+      </w:pPr>
+      <w:rPr>
+        <w:rFonts w:ascii="Symbol" w:hAnsi="Symbol" w:hint="default"/>
+      </w:rPr>
+    </w:lvl>
+    <w:lvl w:ilvl="4" w:tplc="04090003" w:tentative="1">
+      <w:start w:val="1"/>
+      <w:numFmt w:val="bullet"/>
+      <w:lvlText w:val="o"/>
+      <w:lvlJc w:val="left"/>
+      <w:pPr>
+        <w:ind w:left="3600" w:hanging="360"/>
+      </w:pPr>
+      <w:rPr>
+        <w:rFonts w:ascii="Courier New" w:hAnsi="Courier New" w:cs="Courier New" w:hint="default"/>
+      </w:rPr>
+    </w:lvl>
+    <w:lvl w:ilvl="5" w:tplc="04090005" w:tentative="1">
+      <w:start w:val="1"/>
+      <w:numFmt w:val="bullet"/>
+      <w:lvlText w:val=""/>
+      <w:lvlJc w:val="left"/>
+      <w:pPr>
+        <w:ind w:left="4320" w:hanging="360"/>
+      </w:pPr>
+      <w:rPr>
+        <w:rFonts w:ascii="Wingdings" w:hAnsi="Wingdings" w:hint="default"/>
+      </w:rPr>
+    </w:lvl>
+    <w:lvl w:ilvl="6" w:tplc="04090001" w:tentative="1">
+      <w:start w:val="1"/>
+      <w:numFmt w:val="bullet"/>
+      <w:lvlText w:val=""/>
+      <w:lvlJc w:val="left"/>
+      <w:pPr>
+        <w:ind w:left="5040" w:hanging="360"/>
+      </w:pPr>
+      <w:rPr>
+        <w:rFonts w:ascii="Symbol" w:hAnsi="Symbol" w:hint="default"/>
+      </w:rPr>
+    </w:lvl>
+    <w:lvl w:ilvl="7" w:tplc="04090003" w:tentative="1">
+      <w:start w:val="1"/>
+      <w:numFmt w:val="bullet"/>
+      <w:lvlText w:val="o"/>
+      <w:lvlJc w:val="left"/>
+      <w:pPr>
+        <w:ind w:left="5760" w:hanging="360"/>
+      </w:pPr>
+      <w:rPr>
+        <w:rFonts w:ascii="Courier New" w:hAnsi="Courier New" w:cs="Courier New" w:hint="default"/>
+      </w:rPr>
+    </w:lvl>
+    <w:lvl w:ilvl="8" w:tplc="04090005" w:tentative="1">
+      <w:start w:val="1"/>
+      <w:numFmt w:val="bullet"/>
+      <w:lvlText w:val=""/>
+      <w:lvlJc w:val="left"/>
+      <w:pPr>
+        <w:ind w:left="6480" w:hanging="360"/>
+      </w:pPr>
+      <w:rPr>
+        <w:rFonts w:ascii="Wingdings" w:hAnsi="Wingdings" w:hint="default"/>
+      </w:rPr>
+    </w:lvl>
+  </w:abstractNum>
+  <w:abstractNum w:abstractNumId="11" w15:restartNumberingAfterBreak="0">
     <w:nsid w:val="585F0520"/>
     <w:multiLevelType w:val="hybridMultilevel"/>
     <w:tmpl w:val="7FF44AE8"/>
@@ -15268,7 +16108,7 @@
       </w:pPr>
     </w:lvl>
   </w:abstractNum>
-  <w:abstractNum w:abstractNumId="10" w15:restartNumberingAfterBreak="0">
+  <w:abstractNum w:abstractNumId="12" w15:restartNumberingAfterBreak="0">
     <w:nsid w:val="5D45571C"/>
     <w:multiLevelType w:val="hybridMultilevel"/>
     <w:tmpl w:val="19649354"/>
@@ -15381,10 +16221,10 @@
       </w:rPr>
     </w:lvl>
   </w:abstractNum>
-  <w:abstractNum w:abstractNumId="11" w15:restartNumberingAfterBreak="0">
-    <w:nsid w:val="73880B04"/>
+  <w:abstractNum w:abstractNumId="13" w15:restartNumberingAfterBreak="0">
+    <w:nsid w:val="69B47A15"/>
     <w:multiLevelType w:val="hybridMultilevel"/>
-    <w:tmpl w:val="AF1656EE"/>
+    <w:tmpl w:val="50844B26"/>
     <w:lvl w:ilvl="0" w:tplc="04090001">
       <w:start w:val="1"/>
       <w:numFmt w:val="bullet"/>
@@ -15494,7 +16334,120 @@
       </w:rPr>
     </w:lvl>
   </w:abstractNum>
-  <w:abstractNum w:abstractNumId="12" w15:restartNumberingAfterBreak="0">
+  <w:abstractNum w:abstractNumId="14" w15:restartNumberingAfterBreak="0">
+    <w:nsid w:val="73880B04"/>
+    <w:multiLevelType w:val="hybridMultilevel"/>
+    <w:tmpl w:val="AF1656EE"/>
+    <w:lvl w:ilvl="0" w:tplc="04090001">
+      <w:start w:val="1"/>
+      <w:numFmt w:val="bullet"/>
+      <w:lvlText w:val=""/>
+      <w:lvlJc w:val="left"/>
+      <w:pPr>
+        <w:ind w:left="720" w:hanging="360"/>
+      </w:pPr>
+      <w:rPr>
+        <w:rFonts w:ascii="Symbol" w:hAnsi="Symbol" w:hint="default"/>
+      </w:rPr>
+    </w:lvl>
+    <w:lvl w:ilvl="1" w:tplc="04090003" w:tentative="1">
+      <w:start w:val="1"/>
+      <w:numFmt w:val="bullet"/>
+      <w:lvlText w:val="o"/>
+      <w:lvlJc w:val="left"/>
+      <w:pPr>
+        <w:ind w:left="1440" w:hanging="360"/>
+      </w:pPr>
+      <w:rPr>
+        <w:rFonts w:ascii="Courier New" w:hAnsi="Courier New" w:cs="Courier New" w:hint="default"/>
+      </w:rPr>
+    </w:lvl>
+    <w:lvl w:ilvl="2" w:tplc="04090005" w:tentative="1">
+      <w:start w:val="1"/>
+      <w:numFmt w:val="bullet"/>
+      <w:lvlText w:val=""/>
+      <w:lvlJc w:val="left"/>
+      <w:pPr>
+        <w:ind w:left="2160" w:hanging="360"/>
+      </w:pPr>
+      <w:rPr>
+        <w:rFonts w:ascii="Wingdings" w:hAnsi="Wingdings" w:hint="default"/>
+      </w:rPr>
+    </w:lvl>
+    <w:lvl w:ilvl="3" w:tplc="04090001" w:tentative="1">
+      <w:start w:val="1"/>
+      <w:numFmt w:val="bullet"/>
+      <w:lvlText w:val=""/>
+      <w:lvlJc w:val="left"/>
+      <w:pPr>
+        <w:ind w:left="2880" w:hanging="360"/>
+      </w:pPr>
+      <w:rPr>
+        <w:rFonts w:ascii="Symbol" w:hAnsi="Symbol" w:hint="default"/>
+      </w:rPr>
+    </w:lvl>
+    <w:lvl w:ilvl="4" w:tplc="04090003" w:tentative="1">
+      <w:start w:val="1"/>
+      <w:numFmt w:val="bullet"/>
+      <w:lvlText w:val="o"/>
+      <w:lvlJc w:val="left"/>
+      <w:pPr>
+        <w:ind w:left="3600" w:hanging="360"/>
+      </w:pPr>
+      <w:rPr>
+        <w:rFonts w:ascii="Courier New" w:hAnsi="Courier New" w:cs="Courier New" w:hint="default"/>
+      </w:rPr>
+    </w:lvl>
+    <w:lvl w:ilvl="5" w:tplc="04090005" w:tentative="1">
+      <w:start w:val="1"/>
+      <w:numFmt w:val="bullet"/>
+      <w:lvlText w:val=""/>
+      <w:lvlJc w:val="left"/>
+      <w:pPr>
+        <w:ind w:left="4320" w:hanging="360"/>
+      </w:pPr>
+      <w:rPr>
+        <w:rFonts w:ascii="Wingdings" w:hAnsi="Wingdings" w:hint="default"/>
+      </w:rPr>
+    </w:lvl>
+    <w:lvl w:ilvl="6" w:tplc="04090001" w:tentative="1">
+      <w:start w:val="1"/>
+      <w:numFmt w:val="bullet"/>
+      <w:lvlText w:val=""/>
+      <w:lvlJc w:val="left"/>
+      <w:pPr>
+        <w:ind w:left="5040" w:hanging="360"/>
+      </w:pPr>
+      <w:rPr>
+        <w:rFonts w:ascii="Symbol" w:hAnsi="Symbol" w:hint="default"/>
+      </w:rPr>
+    </w:lvl>
+    <w:lvl w:ilvl="7" w:tplc="04090003" w:tentative="1">
+      <w:start w:val="1"/>
+      <w:numFmt w:val="bullet"/>
+      <w:lvlText w:val="o"/>
+      <w:lvlJc w:val="left"/>
+      <w:pPr>
+        <w:ind w:left="5760" w:hanging="360"/>
+      </w:pPr>
+      <w:rPr>
+        <w:rFonts w:ascii="Courier New" w:hAnsi="Courier New" w:cs="Courier New" w:hint="default"/>
+      </w:rPr>
+    </w:lvl>
+    <w:lvl w:ilvl="8" w:tplc="04090005" w:tentative="1">
+      <w:start w:val="1"/>
+      <w:numFmt w:val="bullet"/>
+      <w:lvlText w:val=""/>
+      <w:lvlJc w:val="left"/>
+      <w:pPr>
+        <w:ind w:left="6480" w:hanging="360"/>
+      </w:pPr>
+      <w:rPr>
+        <w:rFonts w:ascii="Wingdings" w:hAnsi="Wingdings" w:hint="default"/>
+      </w:rPr>
+    </w:lvl>
+  </w:abstractNum>
+  <w:abstractNum w:abstractNumId="15" w15:restartNumberingAfterBreak="0">
     <w:nsid w:val="77815316"/>
     <w:multiLevelType w:val="multilevel"/>
     <w:tmpl w:val="96DE393C"/>
@@ -15608,31 +16561,31 @@
     </w:lvl>
   </w:abstractNum>
   <w:num w:numId="1">
-    <w:abstractNumId w:val="12"/>
+    <w:abstractNumId w:val="15"/>
   </w:num>
   <w:num w:numId="2">
     <w:abstractNumId w:val="0"/>
   </w:num>
   <w:num w:numId="3">
-    <w:abstractNumId w:val="6"/>
+    <w:abstractNumId w:val="7"/>
   </w:num>
   <w:num w:numId="4">
     <w:abstractNumId w:val="1"/>
   </w:num>
   <w:num w:numId="5">
-    <w:abstractNumId w:val="10"/>
+    <w:abstractNumId w:val="12"/>
   </w:num>
   <w:num w:numId="6">
     <w:abstractNumId w:val="2"/>
   </w:num>
   <w:num w:numId="7">
-    <w:abstractNumId w:val="8"/>
+    <w:abstractNumId w:val="9"/>
   </w:num>
   <w:num w:numId="8">
-    <w:abstractNumId w:val="9"/>
+    <w:abstractNumId w:val="11"/>
   </w:num>
   <w:num w:numId="9">
-    <w:abstractNumId w:val="7"/>
+    <w:abstractNumId w:val="8"/>
   </w:num>
   <w:num w:numId="10">
     <w:abstractNumId w:val="3"/>
@@ -15641,10 +16594,19 @@
     <w:abstractNumId w:val="4"/>
   </w:num>
   <w:num w:numId="12">
-    <w:abstractNumId w:val="11"/>
+    <w:abstractNumId w:val="14"/>
   </w:num>
   <w:num w:numId="13">
     <w:abstractNumId w:val="5"/>
+  </w:num>
+  <w:num w:numId="14">
+    <w:abstractNumId w:val="13"/>
+  </w:num>
+  <w:num w:numId="15">
+    <w:abstractNumId w:val="10"/>
+  </w:num>
+  <w:num w:numId="16">
+    <w:abstractNumId w:val="6"/>
   </w:num>
 </w:numbering>
 </file>

</xml_diff>